<commit_message>
Atualiza a documentação do projeto e o plano de VV&T para a entrega final
</commit_message>
<xml_diff>
--- a/Documentacao_-_Projeto_Vendas.docx
+++ b/Documentacao_-_Projeto_Vendas.docx
@@ -45,9 +45,9 @@
       </w:tblPr>
       <w:tblGrid>
         <w:gridCol w:w="1186"/>
-        <w:gridCol w:w="2432"/>
-        <w:gridCol w:w="3625"/>
-        <w:gridCol w:w="2117"/>
+        <w:gridCol w:w="2249"/>
+        <w:gridCol w:w="3778"/>
+        <w:gridCol w:w="2147"/>
       </w:tblGrid>
       <w:tr>
         <w:trPr>
@@ -66,7 +66,7 @@
         </w:tc>
         <w:tc>
           <w:tcPr>
-            <w:tcW w:w="2432" w:type="dxa"/>
+            <w:tcW w:w="2249" w:type="dxa"/>
             <w:shd w:val="clear" w:color="auto" w:fill="F2F2F2"/>
           </w:tcPr>
           <w:p>
@@ -77,7 +77,7 @@
         </w:tc>
         <w:tc>
           <w:tcPr>
-            <w:tcW w:w="3625" w:type="dxa"/>
+            <w:tcW w:w="3778" w:type="dxa"/>
             <w:shd w:val="clear" w:color="auto" w:fill="F2F2F2"/>
           </w:tcPr>
           <w:p>
@@ -88,7 +88,7 @@
         </w:tc>
         <w:tc>
           <w:tcPr>
-            <w:tcW w:w="2117" w:type="dxa"/>
+            <w:tcW w:w="2147" w:type="dxa"/>
             <w:shd w:val="clear" w:color="auto" w:fill="F2F2F2"/>
           </w:tcPr>
           <w:p>
@@ -111,7 +111,7 @@
         </w:tc>
         <w:tc>
           <w:tcPr>
-            <w:tcW w:w="2432" w:type="dxa"/>
+            <w:tcW w:w="2249" w:type="dxa"/>
           </w:tcPr>
           <w:p>
             <w:r>
@@ -121,7 +121,7 @@
         </w:tc>
         <w:tc>
           <w:tcPr>
-            <w:tcW w:w="3625" w:type="dxa"/>
+            <w:tcW w:w="3778" w:type="dxa"/>
           </w:tcPr>
           <w:p>
             <w:r>
@@ -137,7 +137,7 @@
         </w:tc>
         <w:tc>
           <w:tcPr>
-            <w:tcW w:w="2117" w:type="dxa"/>
+            <w:tcW w:w="2147" w:type="dxa"/>
           </w:tcPr>
           <w:p>
             <w:r>
@@ -159,7 +159,7 @@
         </w:tc>
         <w:tc>
           <w:tcPr>
-            <w:tcW w:w="2432" w:type="dxa"/>
+            <w:tcW w:w="2249" w:type="dxa"/>
           </w:tcPr>
           <w:p>
             <w:r>
@@ -169,7 +169,7 @@
         </w:tc>
         <w:tc>
           <w:tcPr>
-            <w:tcW w:w="3625" w:type="dxa"/>
+            <w:tcW w:w="3778" w:type="dxa"/>
           </w:tcPr>
           <w:p>
             <w:r>
@@ -185,7 +185,7 @@
         </w:tc>
         <w:tc>
           <w:tcPr>
-            <w:tcW w:w="2117" w:type="dxa"/>
+            <w:tcW w:w="2147" w:type="dxa"/>
           </w:tcPr>
           <w:p>
             <w:r>
@@ -207,31 +207,37 @@
         </w:tc>
         <w:tc>
           <w:tcPr>
-            <w:tcW w:w="2432" w:type="dxa"/>
-          </w:tcPr>
-          <w:p>
-            <w:r>
-              <w:t>Mobile (APK)</w:t>
-            </w:r>
-          </w:p>
-        </w:tc>
-        <w:tc>
-          <w:tcPr>
-            <w:tcW w:w="3625" w:type="dxa"/>
-          </w:tcPr>
-          <w:p>
-            <w:r>
-              <w:t>Projeto-FrontMobile</w:t>
-            </w:r>
-          </w:p>
-        </w:tc>
-        <w:tc>
-          <w:tcPr>
-            <w:tcW w:w="2117" w:type="dxa"/>
-          </w:tcPr>
-          <w:p>
-            <w:r>
-              <w:t>Integrado à API; APK pendente</w:t>
+            <w:tcW w:w="2249" w:type="dxa"/>
+          </w:tcPr>
+          <w:p>
+            <w:r>
+              <w:t>Mobile</w:t>
+            </w:r>
+          </w:p>
+        </w:tc>
+        <w:tc>
+          <w:tcPr>
+            <w:tcW w:w="3778" w:type="dxa"/>
+          </w:tcPr>
+          <w:p>
+            <w:r>
+              <w:t xml:space="preserve">Projeto-FrontMobile, versão web em </w:t>
+            </w:r>
+            <w:r>
+              <w:rPr>
+                <w:rStyle w:val="CodeChar"/>
+              </w:rPr>
+              <w:t>https://mobile.20-151-6-104.sslip.io</w:t>
+            </w:r>
+          </w:p>
+        </w:tc>
+        <w:tc>
+          <w:tcPr>
+            <w:tcW w:w="2147" w:type="dxa"/>
+          </w:tcPr>
+          <w:p>
+            <w:r>
+              <w:t>No ar (homologação e produção), publicado pelo CD; APK não gerado</w:t>
             </w:r>
           </w:p>
         </w:tc>
@@ -249,7 +255,7 @@
         </w:tc>
         <w:tc>
           <w:tcPr>
-            <w:tcW w:w="2432" w:type="dxa"/>
+            <w:tcW w:w="2249" w:type="dxa"/>
           </w:tcPr>
           <w:p>
             <w:r>
@@ -259,7 +265,7 @@
         </w:tc>
         <w:tc>
           <w:tcPr>
-            <w:tcW w:w="3625" w:type="dxa"/>
+            <w:tcW w:w="3778" w:type="dxa"/>
           </w:tcPr>
           <w:p>
             <w:r>
@@ -269,14 +275,11 @@
         </w:tc>
         <w:tc>
           <w:tcPr>
-            <w:tcW w:w="2117" w:type="dxa"/>
-          </w:tcPr>
-          <w:p>
-            <w:r>
-              <w:t>Instalado</w:t>
-            </w:r>
-            <w:r>
-              <w:t>res gerados pelo CD (homologação e produção)</w:t>
+            <w:tcW w:w="2147" w:type="dxa"/>
+          </w:tcPr>
+          <w:p>
+            <w:r>
+              <w:t>Instaladores gerados pelo CD (homologação e produção)</w:t>
             </w:r>
           </w:p>
         </w:tc>
@@ -294,7 +297,7 @@
         </w:tc>
         <w:tc>
           <w:tcPr>
-            <w:tcW w:w="2432" w:type="dxa"/>
+            <w:tcW w:w="2249" w:type="dxa"/>
           </w:tcPr>
           <w:p>
             <w:r>
@@ -304,7 +307,7 @@
         </w:tc>
         <w:tc>
           <w:tcPr>
-            <w:tcW w:w="3625" w:type="dxa"/>
+            <w:tcW w:w="3778" w:type="dxa"/>
           </w:tcPr>
           <w:p>
             <w:r>
@@ -314,7 +317,7 @@
         </w:tc>
         <w:tc>
           <w:tcPr>
-            <w:tcW w:w="2117" w:type="dxa"/>
+            <w:tcW w:w="2147" w:type="dxa"/>
           </w:tcPr>
           <w:p>
             <w:r>
@@ -336,7 +339,7 @@
         </w:tc>
         <w:tc>
           <w:tcPr>
-            <w:tcW w:w="2432" w:type="dxa"/>
+            <w:tcW w:w="2249" w:type="dxa"/>
           </w:tcPr>
           <w:p>
             <w:r>
@@ -346,7 +349,7 @@
         </w:tc>
         <w:tc>
           <w:tcPr>
-            <w:tcW w:w="3625" w:type="dxa"/>
+            <w:tcW w:w="3778" w:type="dxa"/>
           </w:tcPr>
           <w:p>
             <w:r>
@@ -356,7 +359,7 @@
         </w:tc>
         <w:tc>
           <w:tcPr>
-            <w:tcW w:w="2117" w:type="dxa"/>
+            <w:tcW w:w="2147" w:type="dxa"/>
           </w:tcPr>
           <w:p>
             <w:r>
@@ -378,7 +381,7 @@
         </w:tc>
         <w:tc>
           <w:tcPr>
-            <w:tcW w:w="2432" w:type="dxa"/>
+            <w:tcW w:w="2249" w:type="dxa"/>
           </w:tcPr>
           <w:p>
             <w:r>
@@ -388,7 +391,7 @@
         </w:tc>
         <w:tc>
           <w:tcPr>
-            <w:tcW w:w="3625" w:type="dxa"/>
+            <w:tcW w:w="3778" w:type="dxa"/>
           </w:tcPr>
           <w:p>
             <w:r>
@@ -398,7 +401,7 @@
         </w:tc>
         <w:tc>
           <w:tcPr>
-            <w:tcW w:w="2117" w:type="dxa"/>
+            <w:tcW w:w="2147" w:type="dxa"/>
           </w:tcPr>
           <w:p>
             <w:r>
@@ -420,7 +423,7 @@
         </w:tc>
         <w:tc>
           <w:tcPr>
-            <w:tcW w:w="2432" w:type="dxa"/>
+            <w:tcW w:w="2249" w:type="dxa"/>
           </w:tcPr>
           <w:p>
             <w:r>
@@ -430,7 +433,7 @@
         </w:tc>
         <w:tc>
           <w:tcPr>
-            <w:tcW w:w="3625" w:type="dxa"/>
+            <w:tcW w:w="3778" w:type="dxa"/>
           </w:tcPr>
           <w:p>
             <w:r>
@@ -440,7 +443,7 @@
         </w:tc>
         <w:tc>
           <w:tcPr>
-            <w:tcW w:w="2117" w:type="dxa"/>
+            <w:tcW w:w="2147" w:type="dxa"/>
           </w:tcPr>
           <w:p>
             <w:r>
@@ -462,7 +465,7 @@
         </w:tc>
         <w:tc>
           <w:tcPr>
-            <w:tcW w:w="2432" w:type="dxa"/>
+            <w:tcW w:w="2249" w:type="dxa"/>
           </w:tcPr>
           <w:p>
             <w:r>
@@ -472,21 +475,24 @@
         </w:tc>
         <w:tc>
           <w:tcPr>
-            <w:tcW w:w="3625" w:type="dxa"/>
-          </w:tcPr>
-          <w:p>
-            <w:r>
-              <w:t>GitHub Projects, seção 12</w:t>
-            </w:r>
-          </w:p>
-        </w:tc>
-        <w:tc>
-          <w:tcPr>
-            <w:tcW w:w="2117" w:type="dxa"/>
-          </w:tcPr>
-          <w:p>
-            <w:r>
-              <w:t>Pendente</w:t>
+            <w:tcW w:w="3778" w:type="dxa"/>
+          </w:tcPr>
+          <w:p>
+            <w:r>
+              <w:t xml:space="preserve">GitHub Projects e pull requests, </w:t>
+            </w:r>
+            <w:r>
+              <w:t>seção 12</w:t>
+            </w:r>
+          </w:p>
+        </w:tc>
+        <w:tc>
+          <w:tcPr>
+            <w:tcW w:w="2147" w:type="dxa"/>
+          </w:tcPr>
+          <w:p>
+            <w:r>
+              <w:t>Pendente (quadro)</w:t>
             </w:r>
           </w:p>
         </w:tc>
@@ -504,7 +510,7 @@
         </w:tc>
         <w:tc>
           <w:tcPr>
-            <w:tcW w:w="2432" w:type="dxa"/>
+            <w:tcW w:w="2249" w:type="dxa"/>
           </w:tcPr>
           <w:p>
             <w:r>
@@ -514,7 +520,7 @@
         </w:tc>
         <w:tc>
           <w:tcPr>
-            <w:tcW w:w="3625" w:type="dxa"/>
+            <w:tcW w:w="3778" w:type="dxa"/>
           </w:tcPr>
           <w:p>
             <w:r>
@@ -524,11 +530,15 @@
         </w:tc>
         <w:tc>
           <w:tcPr>
-            <w:tcW w:w="2117" w:type="dxa"/>
-          </w:tcPr>
-          <w:p>
-            <w:r>
-              <w:t>Plano pronto; roteiro de aceitação em execução</w:t>
+            <w:tcW w:w="2147" w:type="dxa"/>
+          </w:tcPr>
+          <w:p>
+            <w:r>
+              <w:t xml:space="preserve">Pronto; 103 testes automatizados e cobertura mínima de </w:t>
+            </w:r>
+            <w:r>
+              <w:lastRenderedPageBreak/>
+              <w:t>90%</w:t>
             </w:r>
           </w:p>
         </w:tc>
@@ -540,13 +550,14 @@
           </w:tcPr>
           <w:p>
             <w:r>
+              <w:lastRenderedPageBreak/>
               <w:t>Processo</w:t>
             </w:r>
           </w:p>
         </w:tc>
         <w:tc>
           <w:tcPr>
-            <w:tcW w:w="2432" w:type="dxa"/>
+            <w:tcW w:w="2249" w:type="dxa"/>
           </w:tcPr>
           <w:p>
             <w:r>
@@ -556,7 +567,7 @@
         </w:tc>
         <w:tc>
           <w:tcPr>
-            <w:tcW w:w="3625" w:type="dxa"/>
+            <w:tcW w:w="3778" w:type="dxa"/>
           </w:tcPr>
           <w:p>
             <w:r>
@@ -572,7 +583,7 @@
         </w:tc>
         <w:tc>
           <w:tcPr>
-            <w:tcW w:w="2117" w:type="dxa"/>
+            <w:tcW w:w="2147" w:type="dxa"/>
           </w:tcPr>
           <w:p>
             <w:r>
@@ -594,32 +605,27 @@
         </w:tc>
         <w:tc>
           <w:tcPr>
-            <w:tcW w:w="2432" w:type="dxa"/>
-          </w:tcPr>
-          <w:p>
-            <w:r>
-              <w:t xml:space="preserve">Infraestrutura em cloud </w:t>
-            </w:r>
-            <w:r>
-              <w:lastRenderedPageBreak/>
-              <w:t>com Docker</w:t>
-            </w:r>
-          </w:p>
-        </w:tc>
-        <w:tc>
-          <w:tcPr>
-            <w:tcW w:w="3625" w:type="dxa"/>
-          </w:tcPr>
-          <w:p>
-            <w:r>
-              <w:lastRenderedPageBreak/>
+            <w:tcW w:w="2249" w:type="dxa"/>
+          </w:tcPr>
+          <w:p>
+            <w:r>
+              <w:t>Infraestrutura em cloud com Docker</w:t>
+            </w:r>
+          </w:p>
+        </w:tc>
+        <w:tc>
+          <w:tcPr>
+            <w:tcW w:w="3778" w:type="dxa"/>
+          </w:tcPr>
+          <w:p>
+            <w:r>
               <w:t>VPS no Azure, seção 9</w:t>
             </w:r>
           </w:p>
         </w:tc>
         <w:tc>
           <w:tcPr>
-            <w:tcW w:w="2117" w:type="dxa"/>
+            <w:tcW w:w="2147" w:type="dxa"/>
           </w:tcPr>
           <w:p>
             <w:r>
@@ -641,7 +647,7 @@
         </w:tc>
         <w:tc>
           <w:tcPr>
-            <w:tcW w:w="2432" w:type="dxa"/>
+            <w:tcW w:w="2249" w:type="dxa"/>
           </w:tcPr>
           <w:p>
             <w:r>
@@ -651,24 +657,21 @@
         </w:tc>
         <w:tc>
           <w:tcPr>
-            <w:tcW w:w="3625" w:type="dxa"/>
-          </w:tcPr>
-          <w:p>
-            <w:r>
-              <w:t>GitHub Actions na API, no web e no desktop, s</w:t>
-            </w:r>
-            <w:r>
-              <w:t>eção 10</w:t>
-            </w:r>
-          </w:p>
-        </w:tc>
-        <w:tc>
-          <w:tcPr>
-            <w:tcW w:w="2117" w:type="dxa"/>
-          </w:tcPr>
-          <w:p>
-            <w:r>
-              <w:t>Funcionando na API e no web; desktop configurado</w:t>
+            <w:tcW w:w="3778" w:type="dxa"/>
+          </w:tcPr>
+          <w:p>
+            <w:r>
+              <w:t>GitHub Actions nos quatro repositórios, seção 10</w:t>
+            </w:r>
+          </w:p>
+        </w:tc>
+        <w:tc>
+          <w:tcPr>
+            <w:tcW w:w="2147" w:type="dxa"/>
+          </w:tcPr>
+          <w:p>
+            <w:r>
+              <w:t>Funcionando nos quatro</w:t>
             </w:r>
           </w:p>
         </w:tc>
@@ -686,7 +689,7 @@
         </w:tc>
         <w:tc>
           <w:tcPr>
-            <w:tcW w:w="2432" w:type="dxa"/>
+            <w:tcW w:w="2249" w:type="dxa"/>
           </w:tcPr>
           <w:p>
             <w:r>
@@ -696,17 +699,113 @@
         </w:tc>
         <w:tc>
           <w:tcPr>
-            <w:tcW w:w="3625" w:type="dxa"/>
-          </w:tcPr>
-          <w:p>
-            <w:r>
-              <w:t>API e web em containers e bancos separados; desktop com instalador de cada ambiente</w:t>
-            </w:r>
-          </w:p>
-        </w:tc>
-        <w:tc>
-          <w:tcPr>
-            <w:tcW w:w="2117" w:type="dxa"/>
+            <w:tcW w:w="3778" w:type="dxa"/>
+          </w:tcPr>
+          <w:p>
+            <w:r>
+              <w:t>API, web e mobile em containers e bancos separados; desktop com instalador de cada ambiente</w:t>
+            </w:r>
+          </w:p>
+        </w:tc>
+        <w:tc>
+          <w:tcPr>
+            <w:tcW w:w="2147" w:type="dxa"/>
+          </w:tcPr>
+          <w:p>
+            <w:r>
+              <w:t>No a</w:t>
+            </w:r>
+            <w:r>
+              <w:t>r</w:t>
+            </w:r>
+          </w:p>
+        </w:tc>
+      </w:tr>
+      <w:tr>
+        <w:tc>
+          <w:tcPr>
+            <w:tcW w:w="1186" w:type="dxa"/>
+          </w:tcPr>
+          <w:p>
+            <w:r>
+              <w:t>DevOps</w:t>
+            </w:r>
+          </w:p>
+        </w:tc>
+        <w:tc>
+          <w:tcPr>
+            <w:tcW w:w="2249" w:type="dxa"/>
+          </w:tcPr>
+          <w:p>
+            <w:r>
+              <w:t>Backup do banco</w:t>
+            </w:r>
+          </w:p>
+        </w:tc>
+        <w:tc>
+          <w:tcPr>
+            <w:tcW w:w="3778" w:type="dxa"/>
+          </w:tcPr>
+          <w:p>
+            <w:r>
+              <w:t xml:space="preserve">Container </w:t>
+            </w:r>
+            <w:r>
+              <w:rPr>
+                <w:rStyle w:val="CodeChar"/>
+              </w:rPr>
+              <w:t>backup</w:t>
+            </w:r>
+            <w:r>
+              <w:t>, seção 9</w:t>
+            </w:r>
+          </w:p>
+        </w:tc>
+        <w:tc>
+          <w:tcPr>
+            <w:tcW w:w="2147" w:type="dxa"/>
+          </w:tcPr>
+          <w:p>
+            <w:r>
+              <w:t>No ar, diário</w:t>
+            </w:r>
+          </w:p>
+        </w:tc>
+      </w:tr>
+      <w:tr>
+        <w:tc>
+          <w:tcPr>
+            <w:tcW w:w="1186" w:type="dxa"/>
+          </w:tcPr>
+          <w:p>
+            <w:r>
+              <w:t>DevOps</w:t>
+            </w:r>
+          </w:p>
+        </w:tc>
+        <w:tc>
+          <w:tcPr>
+            <w:tcW w:w="2249" w:type="dxa"/>
+          </w:tcPr>
+          <w:p>
+            <w:r>
+              <w:t>Observabilidade e monitoramento</w:t>
+            </w:r>
+          </w:p>
+        </w:tc>
+        <w:tc>
+          <w:tcPr>
+            <w:tcW w:w="3778" w:type="dxa"/>
+          </w:tcPr>
+          <w:p>
+            <w:r>
+              <w:t>Prometheus e Grafana, seção 8</w:t>
+            </w:r>
+          </w:p>
+        </w:tc>
+        <w:tc>
+          <w:tcPr>
+            <w:tcW w:w="2147" w:type="dxa"/>
           </w:tcPr>
           <w:p>
             <w:r>
@@ -728,49 +827,7 @@
         </w:tc>
         <w:tc>
           <w:tcPr>
-            <w:tcW w:w="2432" w:type="dxa"/>
-          </w:tcPr>
-          <w:p>
-            <w:r>
-              <w:t>Observabilidade e monitoramento</w:t>
-            </w:r>
-          </w:p>
-        </w:tc>
-        <w:tc>
-          <w:tcPr>
-            <w:tcW w:w="3625" w:type="dxa"/>
-          </w:tcPr>
-          <w:p>
-            <w:r>
-              <w:t>Prometheus e Grafana, seção 8</w:t>
-            </w:r>
-          </w:p>
-        </w:tc>
-        <w:tc>
-          <w:tcPr>
-            <w:tcW w:w="2117" w:type="dxa"/>
-          </w:tcPr>
-          <w:p>
-            <w:r>
-              <w:t>No ar</w:t>
-            </w:r>
-          </w:p>
-        </w:tc>
-      </w:tr>
-      <w:tr>
-        <w:tc>
-          <w:tcPr>
-            <w:tcW w:w="1186" w:type="dxa"/>
-          </w:tcPr>
-          <w:p>
-            <w:r>
-              <w:t>DevOps</w:t>
-            </w:r>
-          </w:p>
-        </w:tc>
-        <w:tc>
-          <w:tcPr>
-            <w:tcW w:w="2432" w:type="dxa"/>
+            <w:tcW w:w="2249" w:type="dxa"/>
           </w:tcPr>
           <w:p>
             <w:r>
@@ -780,7 +837,7 @@
         </w:tc>
         <w:tc>
           <w:tcPr>
-            <w:tcW w:w="3625" w:type="dxa"/>
+            <w:tcW w:w="3778" w:type="dxa"/>
           </w:tcPr>
           <w:p>
             <w:r>
@@ -790,7 +847,7 @@
         </w:tc>
         <w:tc>
           <w:tcPr>
-            <w:tcW w:w="2117" w:type="dxa"/>
+            <w:tcW w:w="2147" w:type="dxa"/>
           </w:tcPr>
           <w:p>
             <w:r>
@@ -855,16 +912,16 @@
     </w:p>
     <w:p>
       <w:r>
-        <w:t>arquitetura do sistema · fronts, VPS e serviço</w:t>
-      </w:r>
-      <w:r>
-        <w:t>s externos</w:t>
-      </w:r>
-    </w:p>
-    <w:p>
-      <w:r>
         <w:lastRenderedPageBreak/>
-        <w:t>Dentro da API o código é dividido em camadas: controllers (rotas HTTP), services (regras de negócio), repositories (acesso ao banco com JPA) e entities/DTOs (dados). Homologação e produção rodam a mesma imagem, cada uma com o seu banco.</w:t>
+        <w:t>arquitetura do sistema · fronts, VPS e serviços externos</w:t>
+      </w:r>
+    </w:p>
+    <w:p>
+      <w:r>
+        <w:t>Dentro da API o código é dividido em camadas: controllers (rota</w:t>
+      </w:r>
+      <w:r>
+        <w:t>s HTTP), services (regras de negócio), repositories (acesso ao banco com JPA) e entities/DTOs (dados). Homologação e produção rodam a mesma imagem, cada uma com o seu banco.</w:t>
       </w:r>
     </w:p>
     <w:p>
@@ -872,10 +929,7 @@
         <w:pStyle w:val="Ttulo2"/>
       </w:pPr>
       <w:r>
-        <w:t>3. Repos</w:t>
-      </w:r>
-      <w:r>
-        <w:t>itórios e tecnologias</w:t>
+        <w:t>3. Repositórios e tecnologias</w:t>
       </w:r>
     </w:p>
     <w:p>
@@ -976,10 +1030,7 @@
           </w:tcPr>
           <w:p>
             <w:r>
-              <w:t>Java 17, Spring Boot 4 (Web, Data JPA, Security, Validation, Actuator), JWT, BCrypt, MySQL/MariaDB, Springdoc OpenAPI, Micrometer, JUnit 5</w:t>
-            </w:r>
-            <w:r>
-              <w:t>, Mockito, JaCoCo, Maven, Docker</w:t>
+              <w:t>Java 17, Spring Boot 4 (Web, Data JPA, Security, Validation, Actuator), JWT, BCrypt, MySQL/MariaDB, Springdoc OpenAPI, Micrometer, JUnit 5, Mockito, JaCoCo, Maven, Docker</w:t>
             </w:r>
           </w:p>
         </w:tc>
@@ -1053,7 +1104,10 @@
           </w:tcPr>
           <w:p>
             <w:r>
-              <w:t>JavaFX 17, Jackson, HttpClient, instalador gerado com jpackage</w:t>
+              <w:t>JavaFX 17, Jackson, HttpClient, i</w:t>
+            </w:r>
+            <w:r>
+              <w:t>nstalador gerado com jpackage</w:t>
             </w:r>
           </w:p>
         </w:tc>
@@ -1090,7 +1144,13 @@
           </w:tcPr>
           <w:p>
             <w:r>
-              <w:t>React Native, Expo, TypeScript</w:t>
+              <w:t xml:space="preserve">React Native, Expo, TypeScript; versão web gerada com </w:t>
+            </w:r>
+            <w:r>
+              <w:rPr>
+                <w:rStyle w:val="CodeChar"/>
+              </w:rPr>
+              <w:t>expo export</w:t>
             </w:r>
           </w:p>
         </w:tc>
@@ -1126,10 +1186,10 @@
     </w:p>
     <w:p>
       <w:r>
-        <w:t>Todas as funcionalidades exigem login, e as regras ficam na API, então valem igua</w:t>
-      </w:r>
-      <w:r>
-        <w:t>lmente para web, desktop e mobile.</w:t>
+        <w:t xml:space="preserve">Todas </w:t>
+      </w:r>
+      <w:r>
+        <w:t>as funcionalidades exigem login, e as regras ficam na API, então valem igualmente para web, desktop e mobile.</w:t>
       </w:r>
     </w:p>
     <w:tbl>
@@ -1187,7 +1247,10 @@
           </w:tcPr>
           <w:p>
             <w:r>
-              <w:t>CPF e senha; CPF aceito com ou sem máscara; a mesma mensagem para CPF inexistente e senha errada; sessão (token) válida por 8 horas</w:t>
+              <w:t>CPF e senha; CPF aceito com ou sem máscara; a mesma mensagem para CPF inexistente e senha errada; sessão (</w:t>
+            </w:r>
+            <w:r>
+              <w:t>token) válida por 8 horas</w:t>
             </w:r>
           </w:p>
         </w:tc>
@@ -1209,10 +1272,7 @@
           </w:tcPr>
           <w:p>
             <w:r>
-              <w:t>Nome (3 a 100 caracteres), CPF únic</w:t>
-            </w:r>
-            <w:r>
-              <w:t>o com 11 dígitos, cargo, senha (mínimo 4 caracteres) e salário maior que zero; o CPF é o login</w:t>
+              <w:t>Nome (3 a 100 caracteres), CPF válido e único, cargo, senha (mínimo 4 caracteres) e salário maior que zero; o CPF é o login</w:t>
             </w:r>
           </w:p>
         </w:tc>
@@ -1224,6 +1284,28 @@
           </w:tcPr>
           <w:p>
             <w:r>
+              <w:t>Cargos</w:t>
+            </w:r>
+          </w:p>
+        </w:tc>
+        <w:tc>
+          <w:tcPr>
+            <w:tcW w:w="6676" w:type="dxa"/>
+          </w:tcPr>
+          <w:p>
+            <w:r>
+              <w:t>Escolhidos numa lista fixa nas três interfaces: Administrador, Gerente, Operador de Caixa, Supervisor, Estoquista e Repositor</w:t>
+            </w:r>
+          </w:p>
+        </w:tc>
+      </w:tr>
+      <w:tr>
+        <w:tc>
+          <w:tcPr>
+            <w:tcW w:w="2683" w:type="dxa"/>
+          </w:tcPr>
+          <w:p>
+            <w:r>
               <w:t>Clientes</w:t>
             </w:r>
           </w:p>
@@ -1234,7 +1316,7 @@
           </w:tcPr>
           <w:p>
             <w:r>
-              <w:t>Nome, CPF com 11 dígitos, e-mail e telefone; histórico de compras por cliente</w:t>
+              <w:t>Nome, CPF válido e único, e-mail e telefone; histórico de compras por cliente</w:t>
             </w:r>
           </w:p>
         </w:tc>
@@ -1246,6 +1328,36 @@
           </w:tcPr>
           <w:p>
             <w:r>
+              <w:t>CPF</w:t>
+            </w:r>
+          </w:p>
+        </w:tc>
+        <w:tc>
+          <w:tcPr>
+            <w:tcW w:w="6676" w:type="dxa"/>
+          </w:tcPr>
+          <w:p>
+            <w:r>
+              <w:t xml:space="preserve">Guardado só com números; precisa ter </w:t>
+            </w:r>
+            <w:r>
+              <w:t xml:space="preserve">11 dígitos e dígitos verificadores corretos; CPFs com todos os dígitos iguais (111.111.111-11) são </w:t>
+            </w:r>
+            <w:r>
+              <w:lastRenderedPageBreak/>
+              <w:t>recusados</w:t>
+            </w:r>
+          </w:p>
+        </w:tc>
+      </w:tr>
+      <w:tr>
+        <w:tc>
+          <w:tcPr>
+            <w:tcW w:w="2683" w:type="dxa"/>
+          </w:tcPr>
+          <w:p>
+            <w:r>
+              <w:lastRenderedPageBreak/>
               <w:t>Produtos</w:t>
             </w:r>
           </w:p>
@@ -1278,7 +1390,10 @@
           </w:tcPr>
           <w:p>
             <w:r>
-              <w:t>Data, cliente, funcionário e itens com quantidade; total calculado pela API; baixa do estoque de cada item</w:t>
+              <w:t>Data (não pode ser no futuro, pelo horário de Brasília), cliente, fu</w:t>
+            </w:r>
+            <w:r>
+              <w:t>ncionário e itens com quantidade; total calculado pela API; baixa do estoque de cada item</w:t>
             </w:r>
           </w:p>
         </w:tc>
@@ -1300,14 +1415,10 @@
           </w:tcPr>
           <w:p>
             <w:r>
-              <w:t>Venda acima do estoque é recusada inteira (nada é gravado); alterar uma venda devolve o estoque antigo antes de baixar o novo; exclui</w:t>
-            </w:r>
-            <w:r>
-              <w:t xml:space="preserve">r </w:t>
-            </w:r>
-            <w:r>
-              <w:lastRenderedPageBreak/>
-              <w:t>devolve os itens ao estoque</w:t>
+              <w:t>Venda acima do estoque é recusada inteira (nada é gravado); alterar uma venda devolve o estoque antigo antes de baixar o novo; excluir devolve os itens ao es</w:t>
+            </w:r>
+            <w:r>
+              <w:t>toque</w:t>
             </w:r>
           </w:p>
         </w:tc>
@@ -1319,7 +1430,28 @@
           </w:tcPr>
           <w:p>
             <w:r>
-              <w:lastRenderedPageBreak/>
+              <w:t>Exclusões</w:t>
+            </w:r>
+          </w:p>
+        </w:tc>
+        <w:tc>
+          <w:tcPr>
+            <w:tcW w:w="6676" w:type="dxa"/>
+          </w:tcPr>
+          <w:p>
+            <w:r>
+              <w:t>Cliente, funcionário ou produto que aparece em vendas não pode ser excluído (mensagem clara, status 409)</w:t>
+            </w:r>
+          </w:p>
+        </w:tc>
+      </w:tr>
+      <w:tr>
+        <w:tc>
+          <w:tcPr>
+            <w:tcW w:w="2683" w:type="dxa"/>
+          </w:tcPr>
+          <w:p>
+            <w:r>
               <w:t>Assistente de IA</w:t>
             </w:r>
           </w:p>
@@ -1374,10 +1506,7 @@
           </w:tcPr>
           <w:p>
             <w:r>
-              <w:t>Com o banco sem f</w:t>
-            </w:r>
-            <w:r>
-              <w:t>uncionários, a API cria um Administrador com CPF e senha definidos por variáveis de ambiente</w:t>
+              <w:t>Com o banco sem funcionários, a API cria um Administrador com CPF e senha definidos por variáveis de ambiente</w:t>
             </w:r>
           </w:p>
         </w:tc>
@@ -1393,7 +1522,10 @@
     </w:p>
     <w:p>
       <w:r>
-        <w:t>As três interfaces usam as mesmas rotas da API e exigem login. Web e desktop têm o mesmo conjunto de telas; o mobile foca nos cadastros, nas vendas e no assistente.</w:t>
+        <w:t xml:space="preserve">As três interfaces usam as mesmas rotas da API e exigem login. Web e desktop têm o mesmo conjunto de telas e o mesmo visual; o mobile, pensado para o dia a dia da loja, foca nas vendas, nos cadastros e no assistente, e deixa o gerenciamento (resumo mensal </w:t>
+      </w:r>
+      <w:r>
+        <w:t>e auditoria) para o web e o desktop.</w:t>
       </w:r>
     </w:p>
     <w:tbl>
@@ -1404,10 +1536,10 @@
         <w:tblLook w:val="0420" w:firstRow="1" w:lastRow="0" w:firstColumn="0" w:lastColumn="0" w:noHBand="0" w:noVBand="1"/>
       </w:tblPr>
       <w:tblGrid>
-        <w:gridCol w:w="4920"/>
-        <w:gridCol w:w="720"/>
-        <w:gridCol w:w="1067"/>
-        <w:gridCol w:w="2653"/>
+        <w:gridCol w:w="4258"/>
+        <w:gridCol w:w="1398"/>
+        <w:gridCol w:w="1786"/>
+        <w:gridCol w:w="1918"/>
       </w:tblGrid>
       <w:tr>
         <w:trPr>
@@ -1415,18 +1547,18 @@
         </w:trPr>
         <w:tc>
           <w:tcPr>
-            <w:tcW w:w="4920" w:type="dxa"/>
+            <w:tcW w:w="4258" w:type="dxa"/>
             <w:shd w:val="clear" w:color="auto" w:fill="F2F2F2"/>
           </w:tcPr>
           <w:p>
             <w:r>
-              <w:t>Tela</w:t>
-            </w:r>
-          </w:p>
-        </w:tc>
-        <w:tc>
-          <w:tcPr>
-            <w:tcW w:w="720" w:type="dxa"/>
+              <w:t>Tela ou recurso</w:t>
+            </w:r>
+          </w:p>
+        </w:tc>
+        <w:tc>
+          <w:tcPr>
+            <w:tcW w:w="1398" w:type="dxa"/>
             <w:shd w:val="clear" w:color="auto" w:fill="F2F2F2"/>
           </w:tcPr>
           <w:p>
@@ -1437,7 +1569,7 @@
         </w:tc>
         <w:tc>
           <w:tcPr>
-            <w:tcW w:w="1067" w:type="dxa"/>
+            <w:tcW w:w="1786" w:type="dxa"/>
             <w:shd w:val="clear" w:color="auto" w:fill="F2F2F2"/>
           </w:tcPr>
           <w:p>
@@ -1448,7 +1580,7 @@
         </w:tc>
         <w:tc>
           <w:tcPr>
-            <w:tcW w:w="2653" w:type="dxa"/>
+            <w:tcW w:w="1918" w:type="dxa"/>
             <w:shd w:val="clear" w:color="auto" w:fill="F2F2F2"/>
           </w:tcPr>
           <w:p>
@@ -1461,7 +1593,7 @@
       <w:tr>
         <w:tc>
           <w:tcPr>
-            <w:tcW w:w="4920" w:type="dxa"/>
+            <w:tcW w:w="4258" w:type="dxa"/>
           </w:tcPr>
           <w:p>
             <w:r>
@@ -1471,7 +1603,7 @@
         </w:tc>
         <w:tc>
           <w:tcPr>
-            <w:tcW w:w="720" w:type="dxa"/>
+            <w:tcW w:w="1398" w:type="dxa"/>
           </w:tcPr>
           <w:p>
             <w:r>
@@ -1481,7 +1613,7 @@
         </w:tc>
         <w:tc>
           <w:tcPr>
-            <w:tcW w:w="1067" w:type="dxa"/>
+            <w:tcW w:w="1786" w:type="dxa"/>
           </w:tcPr>
           <w:p>
             <w:r>
@@ -1491,7 +1623,7 @@
         </w:tc>
         <w:tc>
           <w:tcPr>
-            <w:tcW w:w="2653" w:type="dxa"/>
+            <w:tcW w:w="1918" w:type="dxa"/>
           </w:tcPr>
           <w:p>
             <w:r>
@@ -1503,20 +1635,101 @@
       <w:tr>
         <w:tc>
           <w:tcPr>
-            <w:tcW w:w="4920" w:type="dxa"/>
-          </w:tcPr>
-          <w:p>
-            <w:r>
-              <w:t>Início com resumo (produtos, cl</w:t>
-            </w:r>
-            <w:r>
-              <w:t>ientes, vendas)</w:t>
-            </w:r>
-          </w:p>
-        </w:tc>
-        <w:tc>
-          <w:tcPr>
-            <w:tcW w:w="720" w:type="dxa"/>
+            <w:tcW w:w="4258" w:type="dxa"/>
+          </w:tcPr>
+          <w:p>
+            <w:r>
+              <w:t>Quem pode entrar</w:t>
+            </w:r>
+          </w:p>
+        </w:tc>
+        <w:tc>
+          <w:tcPr>
+            <w:tcW w:w="1398" w:type="dxa"/>
+          </w:tcPr>
+          <w:p>
+            <w:r>
+              <w:t>Qualquer funcionário</w:t>
+            </w:r>
+          </w:p>
+        </w:tc>
+        <w:tc>
+          <w:tcPr>
+            <w:tcW w:w="1786" w:type="dxa"/>
+          </w:tcPr>
+          <w:p>
+            <w:r>
+              <w:t>Administrador, Gerente e Operador de Caixa</w:t>
+            </w:r>
+          </w:p>
+        </w:tc>
+        <w:tc>
+          <w:tcPr>
+            <w:tcW w:w="1918" w:type="dxa"/>
+          </w:tcPr>
+          <w:p>
+            <w:r>
+              <w:t>Qualquer funcionário</w:t>
+            </w:r>
+          </w:p>
+        </w:tc>
+      </w:tr>
+      <w:tr>
+        <w:tc>
+          <w:tcPr>
+            <w:tcW w:w="4258" w:type="dxa"/>
+          </w:tcPr>
+          <w:p>
+            <w:r>
+              <w:t>Navegação</w:t>
+            </w:r>
+          </w:p>
+        </w:tc>
+        <w:tc>
+          <w:tcPr>
+            <w:tcW w:w="1398" w:type="dxa"/>
+          </w:tcPr>
+          <w:p>
+            <w:r>
+              <w:t>Menu lateral</w:t>
+            </w:r>
+          </w:p>
+        </w:tc>
+        <w:tc>
+          <w:tcPr>
+            <w:tcW w:w="1786" w:type="dxa"/>
+          </w:tcPr>
+          <w:p>
+            <w:r>
+              <w:t>Menu lateral</w:t>
+            </w:r>
+          </w:p>
+        </w:tc>
+        <w:tc>
+          <w:tcPr>
+            <w:tcW w:w="1918" w:type="dxa"/>
+          </w:tcPr>
+          <w:p>
+            <w:r>
+              <w:t>Barra inferior (Início, Vendas, Produtos, Mais)</w:t>
+            </w:r>
+          </w:p>
+        </w:tc>
+      </w:tr>
+      <w:tr>
+        <w:tc>
+          <w:tcPr>
+            <w:tcW w:w="4258" w:type="dxa"/>
+          </w:tcPr>
+          <w:p>
+            <w:r>
+              <w:t>Início com resumo (produtos, clientes, vendas)</w:t>
+            </w:r>
+          </w:p>
+        </w:tc>
+        <w:tc>
+          <w:tcPr>
+            <w:tcW w:w="1398" w:type="dxa"/>
           </w:tcPr>
           <w:p>
             <w:r>
@@ -1526,7 +1739,7 @@
         </w:tc>
         <w:tc>
           <w:tcPr>
-            <w:tcW w:w="1067" w:type="dxa"/>
+            <w:tcW w:w="1786" w:type="dxa"/>
           </w:tcPr>
           <w:p>
             <w:r>
@@ -1536,7 +1749,7 @@
         </w:tc>
         <w:tc>
           <w:tcPr>
-            <w:tcW w:w="2653" w:type="dxa"/>
+            <w:tcW w:w="1918" w:type="dxa"/>
           </w:tcPr>
           <w:p>
             <w:r>
@@ -1548,7 +1761,7 @@
       <w:tr>
         <w:tc>
           <w:tcPr>
-            <w:tcW w:w="4920" w:type="dxa"/>
+            <w:tcW w:w="4258" w:type="dxa"/>
           </w:tcPr>
           <w:p>
             <w:r>
@@ -1558,7 +1771,7 @@
         </w:tc>
         <w:tc>
           <w:tcPr>
-            <w:tcW w:w="720" w:type="dxa"/>
+            <w:tcW w:w="1398" w:type="dxa"/>
           </w:tcPr>
           <w:p>
             <w:r>
@@ -1568,7 +1781,7 @@
         </w:tc>
         <w:tc>
           <w:tcPr>
-            <w:tcW w:w="1067" w:type="dxa"/>
+            <w:tcW w:w="1786" w:type="dxa"/>
           </w:tcPr>
           <w:p>
             <w:r>
@@ -1578,29 +1791,79 @@
         </w:tc>
         <w:tc>
           <w:tcPr>
-            <w:tcW w:w="2653" w:type="dxa"/>
-          </w:tcPr>
-          <w:p>
-            <w:r>
-              <w:t>Registro de venda com itens</w:t>
-            </w:r>
-          </w:p>
-        </w:tc>
-      </w:tr>
-      <w:tr>
-        <w:tc>
-          <w:tcPr>
-            <w:tcW w:w="4920" w:type="dxa"/>
-          </w:tcPr>
-          <w:p>
-            <w:r>
-              <w:t>Produtos</w:t>
-            </w:r>
-          </w:p>
-        </w:tc>
-        <w:tc>
-          <w:tcPr>
-            <w:tcW w:w="720" w:type="dxa"/>
+            <w:tcW w:w="1918" w:type="dxa"/>
+          </w:tcPr>
+          <w:p>
+            <w:r>
+              <w:t xml:space="preserve">Sim, em 3 etapas (cliente, vendedor, </w:t>
+            </w:r>
+            <w:r>
+              <w:lastRenderedPageBreak/>
+              <w:t>produtos)</w:t>
+            </w:r>
+          </w:p>
+        </w:tc>
+      </w:tr>
+      <w:tr>
+        <w:tc>
+          <w:tcPr>
+            <w:tcW w:w="4258" w:type="dxa"/>
+          </w:tcPr>
+          <w:p>
+            <w:r>
+              <w:lastRenderedPageBreak/>
+              <w:t xml:space="preserve">Produtos, Clientes e Funcionários (cadastro, </w:t>
+            </w:r>
+            <w:r>
+              <w:t>edição e exclusão)</w:t>
+            </w:r>
+          </w:p>
+        </w:tc>
+        <w:tc>
+          <w:tcPr>
+            <w:tcW w:w="1398" w:type="dxa"/>
+          </w:tcPr>
+          <w:p>
+            <w:r>
+              <w:t>Sim, com paginação</w:t>
+            </w:r>
+          </w:p>
+        </w:tc>
+        <w:tc>
+          <w:tcPr>
+            <w:tcW w:w="1786" w:type="dxa"/>
+          </w:tcPr>
+          <w:p>
+            <w:r>
+              <w:t>Sim, com paginação</w:t>
+            </w:r>
+          </w:p>
+        </w:tc>
+        <w:tc>
+          <w:tcPr>
+            <w:tcW w:w="1918" w:type="dxa"/>
+          </w:tcPr>
+          <w:p>
+            <w:r>
+              <w:t>Sim, com rolagem</w:t>
+            </w:r>
+          </w:p>
+        </w:tc>
+      </w:tr>
+      <w:tr>
+        <w:tc>
+          <w:tcPr>
+            <w:tcW w:w="4258" w:type="dxa"/>
+          </w:tcPr>
+          <w:p>
+            <w:r>
+              <w:t>Cargo escolhido em lista fixa</w:t>
+            </w:r>
+          </w:p>
+        </w:tc>
+        <w:tc>
+          <w:tcPr>
+            <w:tcW w:w="1398" w:type="dxa"/>
           </w:tcPr>
           <w:p>
             <w:r>
@@ -1610,7 +1873,7 @@
         </w:tc>
         <w:tc>
           <w:tcPr>
-            <w:tcW w:w="1067" w:type="dxa"/>
+            <w:tcW w:w="1786" w:type="dxa"/>
           </w:tcPr>
           <w:p>
             <w:r>
@@ -1620,7 +1883,7 @@
         </w:tc>
         <w:tc>
           <w:tcPr>
-            <w:tcW w:w="2653" w:type="dxa"/>
+            <w:tcW w:w="1918" w:type="dxa"/>
           </w:tcPr>
           <w:p>
             <w:r>
@@ -1632,17 +1895,59 @@
       <w:tr>
         <w:tc>
           <w:tcPr>
-            <w:tcW w:w="4920" w:type="dxa"/>
-          </w:tcPr>
-          <w:p>
-            <w:r>
-              <w:t>Clientes</w:t>
-            </w:r>
-          </w:p>
-        </w:tc>
-        <w:tc>
-          <w:tcPr>
-            <w:tcW w:w="720" w:type="dxa"/>
+            <w:tcW w:w="4258" w:type="dxa"/>
+          </w:tcPr>
+          <w:p>
+            <w:r>
+              <w:t>CPF conferido antes de enviar</w:t>
+            </w:r>
+          </w:p>
+        </w:tc>
+        <w:tc>
+          <w:tcPr>
+            <w:tcW w:w="1398" w:type="dxa"/>
+          </w:tcPr>
+          <w:p>
+            <w:r>
+              <w:t>Pela API</w:t>
+            </w:r>
+          </w:p>
+        </w:tc>
+        <w:tc>
+          <w:tcPr>
+            <w:tcW w:w="1786" w:type="dxa"/>
+          </w:tcPr>
+          <w:p>
+            <w:r>
+              <w:t>Na tela e pela API</w:t>
+            </w:r>
+          </w:p>
+        </w:tc>
+        <w:tc>
+          <w:tcPr>
+            <w:tcW w:w="1918" w:type="dxa"/>
+          </w:tcPr>
+          <w:p>
+            <w:r>
+              <w:t>Pela API</w:t>
+            </w:r>
+          </w:p>
+        </w:tc>
+      </w:tr>
+      <w:tr>
+        <w:tc>
+          <w:tcPr>
+            <w:tcW w:w="4258" w:type="dxa"/>
+          </w:tcPr>
+          <w:p>
+            <w:r>
+              <w:t>Vendas: resumo do mês (total, nº de vendas, ticket médio, itens e ranking de produtos)</w:t>
+            </w:r>
+          </w:p>
+        </w:tc>
+        <w:tc>
+          <w:tcPr>
+            <w:tcW w:w="1398" w:type="dxa"/>
           </w:tcPr>
           <w:p>
             <w:r>
@@ -1652,7 +1957,7 @@
         </w:tc>
         <w:tc>
           <w:tcPr>
-            <w:tcW w:w="1067" w:type="dxa"/>
+            <w:tcW w:w="1786" w:type="dxa"/>
           </w:tcPr>
           <w:p>
             <w:r>
@@ -1662,7 +1967,29 @@
         </w:tc>
         <w:tc>
           <w:tcPr>
-            <w:tcW w:w="2653" w:type="dxa"/>
+            <w:tcW w:w="1918" w:type="dxa"/>
+          </w:tcPr>
+          <w:p>
+            <w:r>
+              <w:t>Lista das vendas realizadas</w:t>
+            </w:r>
+          </w:p>
+        </w:tc>
+      </w:tr>
+      <w:tr>
+        <w:tc>
+          <w:tcPr>
+            <w:tcW w:w="4258" w:type="dxa"/>
+          </w:tcPr>
+          <w:p>
+            <w:r>
+              <w:t>Assistente de Estoque (IA)</w:t>
+            </w:r>
+          </w:p>
+        </w:tc>
+        <w:tc>
+          <w:tcPr>
+            <w:tcW w:w="1398" w:type="dxa"/>
           </w:tcPr>
           <w:p>
             <w:r>
@@ -1670,21 +1997,9 @@
             </w:r>
           </w:p>
         </w:tc>
-      </w:tr>
-      <w:tr>
-        <w:tc>
-          <w:tcPr>
-            <w:tcW w:w="4920" w:type="dxa"/>
-          </w:tcPr>
-          <w:p>
-            <w:r>
-              <w:t>Funcionários</w:t>
-            </w:r>
-          </w:p>
-        </w:tc>
-        <w:tc>
-          <w:tcPr>
-            <w:tcW w:w="720" w:type="dxa"/>
+        <w:tc>
+          <w:tcPr>
+            <w:tcW w:w="1786" w:type="dxa"/>
           </w:tcPr>
           <w:p>
             <w:r>
@@ -1694,7 +2009,29 @@
         </w:tc>
         <w:tc>
           <w:tcPr>
-            <w:tcW w:w="1067" w:type="dxa"/>
+            <w:tcW w:w="1918" w:type="dxa"/>
+          </w:tcPr>
+          <w:p>
+            <w:r>
+              <w:t>Sim (aba Mais)</w:t>
+            </w:r>
+          </w:p>
+        </w:tc>
+      </w:tr>
+      <w:tr>
+        <w:tc>
+          <w:tcPr>
+            <w:tcW w:w="4258" w:type="dxa"/>
+          </w:tcPr>
+          <w:p>
+            <w:r>
+              <w:t>Auditoria (somente Administrador)</w:t>
+            </w:r>
+          </w:p>
+        </w:tc>
+        <w:tc>
+          <w:tcPr>
+            <w:tcW w:w="1398" w:type="dxa"/>
           </w:tcPr>
           <w:p>
             <w:r>
@@ -1704,7 +2041,7 @@
         </w:tc>
         <w:tc>
           <w:tcPr>
-            <w:tcW w:w="2653" w:type="dxa"/>
+            <w:tcW w:w="1786" w:type="dxa"/>
           </w:tcPr>
           <w:p>
             <w:r>
@@ -1712,21 +2049,31 @@
             </w:r>
           </w:p>
         </w:tc>
-      </w:tr>
-      <w:tr>
-        <w:tc>
-          <w:tcPr>
-            <w:tcW w:w="4920" w:type="dxa"/>
-          </w:tcPr>
-          <w:p>
-            <w:r>
-              <w:t>Vendas: resumo do mês (total, nº de vendas, ticket médio, itens e ranking de produtos)</w:t>
-            </w:r>
-          </w:p>
-        </w:tc>
-        <w:tc>
-          <w:tcPr>
-            <w:tcW w:w="720" w:type="dxa"/>
+        <w:tc>
+          <w:tcPr>
+            <w:tcW w:w="1918" w:type="dxa"/>
+          </w:tcPr>
+          <w:p>
+            <w:r>
+              <w:t>—</w:t>
+            </w:r>
+          </w:p>
+        </w:tc>
+      </w:tr>
+      <w:tr>
+        <w:tc>
+          <w:tcPr>
+            <w:tcW w:w="4258" w:type="dxa"/>
+          </w:tcPr>
+          <w:p>
+            <w:r>
+              <w:t>Nome e cargo do usuário logado, com Sair</w:t>
+            </w:r>
+          </w:p>
+        </w:tc>
+        <w:tc>
+          <w:tcPr>
+            <w:tcW w:w="1398" w:type="dxa"/>
           </w:tcPr>
           <w:p>
             <w:r>
@@ -1736,7 +2083,7 @@
         </w:tc>
         <w:tc>
           <w:tcPr>
-            <w:tcW w:w="1067" w:type="dxa"/>
+            <w:tcW w:w="1786" w:type="dxa"/>
           </w:tcPr>
           <w:p>
             <w:r>
@@ -1746,29 +2093,7 @@
         </w:tc>
         <w:tc>
           <w:tcPr>
-            <w:tcW w:w="2653" w:type="dxa"/>
-          </w:tcPr>
-          <w:p>
-            <w:r>
-              <w:t>Lista e edição de vendas</w:t>
-            </w:r>
-          </w:p>
-        </w:tc>
-      </w:tr>
-      <w:tr>
-        <w:tc>
-          <w:tcPr>
-            <w:tcW w:w="4920" w:type="dxa"/>
-          </w:tcPr>
-          <w:p>
-            <w:r>
-              <w:t>Assistente de Estoque (IA)</w:t>
-            </w:r>
-          </w:p>
-        </w:tc>
-        <w:tc>
-          <w:tcPr>
-            <w:tcW w:w="720" w:type="dxa"/>
+            <w:tcW w:w="1918" w:type="dxa"/>
           </w:tcPr>
           <w:p>
             <w:r>
@@ -1776,9 +2101,21 @@
             </w:r>
           </w:p>
         </w:tc>
-        <w:tc>
-          <w:tcPr>
-            <w:tcW w:w="1067" w:type="dxa"/>
+      </w:tr>
+      <w:tr>
+        <w:tc>
+          <w:tcPr>
+            <w:tcW w:w="4258" w:type="dxa"/>
+          </w:tcPr>
+          <w:p>
+            <w:r>
+              <w:t>Sessão expirada volta para o login</w:t>
+            </w:r>
+          </w:p>
+        </w:tc>
+        <w:tc>
+          <w:tcPr>
+            <w:tcW w:w="1398" w:type="dxa"/>
           </w:tcPr>
           <w:p>
             <w:r>
@@ -1788,29 +2125,7 @@
         </w:tc>
         <w:tc>
           <w:tcPr>
-            <w:tcW w:w="2653" w:type="dxa"/>
-          </w:tcPr>
-          <w:p>
-            <w:r>
-              <w:t>Sim (aba Mais)</w:t>
-            </w:r>
-          </w:p>
-        </w:tc>
-      </w:tr>
-      <w:tr>
-        <w:tc>
-          <w:tcPr>
-            <w:tcW w:w="4920" w:type="dxa"/>
-          </w:tcPr>
-          <w:p>
-            <w:r>
-              <w:t>Auditoria (somente Administrador)</w:t>
-            </w:r>
-          </w:p>
-        </w:tc>
-        <w:tc>
-          <w:tcPr>
-            <w:tcW w:w="720" w:type="dxa"/>
+            <w:tcW w:w="1786" w:type="dxa"/>
           </w:tcPr>
           <w:p>
             <w:r>
@@ -1820,101 +2135,7 @@
         </w:tc>
         <w:tc>
           <w:tcPr>
-            <w:tcW w:w="1067" w:type="dxa"/>
-          </w:tcPr>
-          <w:p>
-            <w:r>
-              <w:t>—</w:t>
-            </w:r>
-          </w:p>
-        </w:tc>
-        <w:tc>
-          <w:tcPr>
-            <w:tcW w:w="2653" w:type="dxa"/>
-          </w:tcPr>
-          <w:p>
-            <w:r>
-              <w:t>—</w:t>
-            </w:r>
-          </w:p>
-        </w:tc>
-      </w:tr>
-      <w:tr>
-        <w:tc>
-          <w:tcPr>
-            <w:tcW w:w="4920" w:type="dxa"/>
-          </w:tcPr>
-          <w:p>
-            <w:r>
-              <w:t>Nome e cargo do usuário logado, com Sair</w:t>
-            </w:r>
-          </w:p>
-        </w:tc>
-        <w:tc>
-          <w:tcPr>
-            <w:tcW w:w="720" w:type="dxa"/>
-          </w:tcPr>
-          <w:p>
-            <w:r>
-              <w:t>Sim</w:t>
-            </w:r>
-          </w:p>
-        </w:tc>
-        <w:tc>
-          <w:tcPr>
-            <w:tcW w:w="1067" w:type="dxa"/>
-          </w:tcPr>
-          <w:p>
-            <w:r>
-              <w:t>Sim</w:t>
-            </w:r>
-          </w:p>
-        </w:tc>
-        <w:tc>
-          <w:tcPr>
-            <w:tcW w:w="2653" w:type="dxa"/>
-          </w:tcPr>
-          <w:p>
-            <w:r>
-              <w:t>Sim</w:t>
-            </w:r>
-          </w:p>
-        </w:tc>
-      </w:tr>
-      <w:tr>
-        <w:tc>
-          <w:tcPr>
-            <w:tcW w:w="4920" w:type="dxa"/>
-          </w:tcPr>
-          <w:p>
-            <w:r>
-              <w:t>Sessão expirada volta para o login</w:t>
-            </w:r>
-          </w:p>
-        </w:tc>
-        <w:tc>
-          <w:tcPr>
-            <w:tcW w:w="720" w:type="dxa"/>
-          </w:tcPr>
-          <w:p>
-            <w:r>
-              <w:t>Sim</w:t>
-            </w:r>
-          </w:p>
-        </w:tc>
-        <w:tc>
-          <w:tcPr>
-            <w:tcW w:w="1067" w:type="dxa"/>
-          </w:tcPr>
-          <w:p>
-            <w:r>
-              <w:t>Sim</w:t>
-            </w:r>
-          </w:p>
-        </w:tc>
-        <w:tc>
-          <w:tcPr>
-            <w:tcW w:w="2653" w:type="dxa"/>
+            <w:tcW w:w="1918" w:type="dxa"/>
           </w:tcPr>
           <w:p>
             <w:r>
@@ -2029,7 +2250,6 @@
           </w:tcPr>
           <w:p>
             <w:r>
-              <w:lastRenderedPageBreak/>
               <w:t>Desktop</w:t>
             </w:r>
           </w:p>
@@ -2100,7 +2320,28 @@
           </w:tcPr>
           <w:p>
             <w:r>
-              <w:t>APK para Android (geração pendente; ainda sem pipeline)</w:t>
+              <w:t>Versão web do aplicativo publicada na</w:t>
+            </w:r>
+            <w:r>
+              <w:t xml:space="preserve"> VPS pelo CD: homologação em </w:t>
+            </w:r>
+            <w:r>
+              <w:rPr>
+                <w:rStyle w:val="CodeChar"/>
+              </w:rPr>
+              <w:t>https://mobile-hml.20-151-6-104.sslip.io</w:t>
+            </w:r>
+            <w:r>
+              <w:t xml:space="preserve">, produção em </w:t>
+            </w:r>
+            <w:r>
+              <w:rPr>
+                <w:rStyle w:val="CodeChar"/>
+              </w:rPr>
+              <w:t>https://mobile.20-151-6-104.sslip.io</w:t>
+            </w:r>
+            <w:r>
+              <w:t>. O CI também gera o pacote JavaScript do Android; o APK não é gerado no pipeline</w:t>
             </w:r>
           </w:p>
         </w:tc>
@@ -2116,7 +2357,10 @@
     </w:p>
     <w:p>
       <w:r>
-        <w:t>A segurança é feita em camadas: nada responde sem login, os dados sensíveis não ficam expostos e toda ação deixa rastro.</w:t>
+        <w:t>A segurança é feita em camadas: nada resp</w:t>
+      </w:r>
+      <w:r>
+        <w:t>onde sem login, os dados sensíveis não ficam expostos e toda ação deixa rastro.</w:t>
       </w:r>
     </w:p>
     <w:tbl>
@@ -2164,6 +2408,7 @@
           </w:tcPr>
           <w:p>
             <w:r>
+              <w:lastRenderedPageBreak/>
               <w:t>Autenticação</w:t>
             </w:r>
           </w:p>
@@ -2180,10 +2425,7 @@
               <w:t>POST /auth/login</w:t>
             </w:r>
             <w:r>
-              <w:t xml:space="preserve"> devolve um to</w:t>
-            </w:r>
-            <w:r>
-              <w:t>ken JWT assinado (HS256) que expira em 8 horas; o token leva só o id do funcionário, sem CPF</w:t>
+              <w:t xml:space="preserve"> devolve um token JWT assinado (HS256) que expira em 8 horas; o token leva só o id do funcionário, sem CPF</w:t>
             </w:r>
           </w:p>
         </w:tc>
@@ -2227,7 +2469,10 @@
           </w:tcPr>
           <w:p>
             <w:r>
-              <w:t>A auditoria só é consultada pelo cargo Administrador; outros recebem 403</w:t>
+              <w:t>A auditoria só é consultada pelo cargo Administrador; outros recebem 403. O desktop, que</w:t>
+            </w:r>
+            <w:r>
+              <w:t xml:space="preserve"> é o computador do caixa, só aceita login de Administrador, Gerente e Operador de Caixa</w:t>
             </w:r>
           </w:p>
         </w:tc>
@@ -2277,13 +2522,13 @@
               <w:rPr>
                 <w:rStyle w:val="CodeChar"/>
               </w:rPr>
-              <w:t>1</w:t>
-            </w:r>
-            <w:r>
-              <w:rPr>
-                <w:rStyle w:val="CodeChar"/>
-              </w:rPr>
-              <w:t>23.***.***-01</w:t>
+              <w:t>123.***.</w:t>
+            </w:r>
+            <w:r>
+              <w:rPr>
+                <w:rStyle w:val="CodeChar"/>
+              </w:rPr>
+              <w:t>***-01</w:t>
             </w:r>
             <w:r>
               <w:t>) em logs e na auditoria de login recusado</w:t>
@@ -2298,6 +2543,53 @@
           </w:tcPr>
           <w:p>
             <w:r>
+              <w:t>Validação de dados</w:t>
+            </w:r>
+          </w:p>
+        </w:tc>
+        <w:tc>
+          <w:tcPr>
+            <w:tcW w:w="6190" w:type="dxa"/>
+          </w:tcPr>
+          <w:p>
+            <w:r>
+              <w:t>Toda entrada é validada na API: CPF com dígitos verificadores, CPF único, data de venda não futura, campos obrigatórios e limites; JSON mal formado devolve 400</w:t>
+            </w:r>
+          </w:p>
+        </w:tc>
+      </w:tr>
+      <w:tr>
+        <w:tc>
+          <w:tcPr>
+            <w:tcW w:w="3169" w:type="dxa"/>
+          </w:tcPr>
+          <w:p>
+            <w:r>
+              <w:t>Tratamento de erros</w:t>
+            </w:r>
+          </w:p>
+        </w:tc>
+        <w:tc>
+          <w:tcPr>
+            <w:tcW w:w="6190" w:type="dxa"/>
+          </w:tcPr>
+          <w:p>
+            <w:r>
+              <w:t>O usuá</w:t>
+            </w:r>
+            <w:r>
+              <w:t>rio recebe sempre uma mensagem clara; erros inesperados devolvem 500 com mensagem genérica, e detalhes técnicos (como mensagens do banco) ficam só no log</w:t>
+            </w:r>
+          </w:p>
+        </w:tc>
+      </w:tr>
+      <w:tr>
+        <w:tc>
+          <w:tcPr>
+            <w:tcW w:w="3169" w:type="dxa"/>
+          </w:tcPr>
+          <w:p>
+            <w:r>
               <w:t>CORS</w:t>
             </w:r>
           </w:p>
@@ -2308,7 +2600,10 @@
           </w:tcPr>
           <w:p>
             <w:r>
-              <w:t>Só os endereços do front web configurados podem chamar a API pelo navegador</w:t>
+              <w:t>Só os endereços configurados do front web e da versão web do mobile podem chamar a API pelo nave</w:t>
+            </w:r>
+            <w:r>
+              <w:t>gador</w:t>
             </w:r>
           </w:p>
         </w:tc>
@@ -2352,10 +2647,7 @@
           </w:tcPr>
           <w:p>
             <w:r>
-              <w:t>Chave do JWT, senhas do banco,</w:t>
-            </w:r>
-            <w:r>
-              <w:t xml:space="preserve"> senha do admin e chave da Mistral ficam em variáveis de ambiente (</w:t>
+              <w:t>Chave do JWT, senhas do banco, senha do admin e chave da Mistral ficam em variáveis de ambiente (</w:t>
             </w:r>
             <w:r>
               <w:rPr>
@@ -2430,7 +2722,32 @@
           </w:tcPr>
           <w:p>
             <w:r>
-              <w:t>A API roda com usuário sem privilégios dentro do container</w:t>
+              <w:t>A API roda c</w:t>
+            </w:r>
+            <w:r>
+              <w:t>om usuário sem privilégios dentro do container</w:t>
+            </w:r>
+          </w:p>
+        </w:tc>
+      </w:tr>
+      <w:tr>
+        <w:tc>
+          <w:tcPr>
+            <w:tcW w:w="3169" w:type="dxa"/>
+          </w:tcPr>
+          <w:p>
+            <w:r>
+              <w:t>Cópia de segurança</w:t>
+            </w:r>
+          </w:p>
+        </w:tc>
+        <w:tc>
+          <w:tcPr>
+            <w:tcW w:w="6190" w:type="dxa"/>
+          </w:tcPr>
+          <w:p>
+            <w:r>
+              <w:t>Backup diário dos bancos de produção e homologação (seção 9)</w:t>
             </w:r>
           </w:p>
         </w:tc>
@@ -2441,23 +2758,23 @@
         <w:pStyle w:val="Ttulo2"/>
       </w:pPr>
       <w:r>
+        <w:t>6. Inteligência artificial</w:t>
+      </w:r>
+    </w:p>
+    <w:p>
+      <w:r>
+        <w:t>O assistente responde perguntas em linguagem natural sobre o estoque, como "quais produtos estão com</w:t>
+      </w:r>
+      <w:r>
+        <w:t xml:space="preserve"> menos de 5 unidades?", usando os dados reais do banco no momento da pergunta.</w:t>
+      </w:r>
+    </w:p>
+    <w:p>
+      <w:r>
+        <w:rPr>
+          <w:b/>
+        </w:rPr>
         <w:lastRenderedPageBreak/>
-        <w:t>6. Inteligência artificial</w:t>
-      </w:r>
-    </w:p>
-    <w:p>
-      <w:r>
-        <w:t>O assistente responde perguntas em linguagem natural sobre</w:t>
-      </w:r>
-      <w:r>
-        <w:t xml:space="preserve"> o estoque, como "quais produtos estão com menos de 5 unidades?", usando os dados reais do banco no momento da pergunta.</w:t>
-      </w:r>
-    </w:p>
-    <w:p>
-      <w:r>
-        <w:rPr>
-          <w:b/>
-        </w:rPr>
         <w:t>Como funciona</w:t>
       </w:r>
     </w:p>
@@ -2491,10 +2808,10 @@
         </w:numPr>
       </w:pPr>
       <w:r>
-        <w:t>A API lê todos os produtos do ban</w:t>
-      </w:r>
-      <w:r>
-        <w:t>co (id, nome, descrição, preço e unidades em estoque).</w:t>
+        <w:t xml:space="preserve">A API lê todos os produtos do banco (id, nome, descrição, preço e unidades </w:t>
+      </w:r>
+      <w:r>
+        <w:t>em estoque).</w:t>
       </w:r>
     </w:p>
     <w:p>
@@ -2553,10 +2870,7 @@
         <w:t>ministral-8b-2512</w:t>
       </w:r>
       <w:r>
-        <w:t xml:space="preserve">, </w:t>
-      </w:r>
-      <w:r>
-        <w:t>do plano gratuito da Mistral; o modelo maior (</w:t>
+        <w:t>, do plano gratuito da Mistral; o modelo maior (</w:t>
       </w:r>
       <w:r>
         <w:rPr>
@@ -2610,7 +2924,10 @@
         <w:t>Chave:</w:t>
       </w:r>
       <w:r>
-        <w:t xml:space="preserve"> fica só na variável </w:t>
+        <w:t xml:space="preserve"> fica só</w:t>
+      </w:r>
+      <w:r>
+        <w:t xml:space="preserve"> na variável </w:t>
       </w:r>
       <w:r>
         <w:rPr>
@@ -2655,10 +2972,10 @@
         <w:t>Escopo:</w:t>
       </w:r>
       <w:r>
-        <w:t xml:space="preserve"> o assistente só consult</w:t>
-      </w:r>
-      <w:r>
-        <w:t>a; ele não altera estoque nem registra vendas. Perguntas fora do assunto ou sem resposta nos dados são recusadas pela própria instrução enviada ao modelo.</w:t>
+        <w:t xml:space="preserve"> o assistente só consulta; ele n</w:t>
+      </w:r>
+      <w:r>
+        <w:t>ão altera estoque nem registra vendas. Perguntas fora do assunto ou sem resposta nos dados são recusadas pela própria instrução enviada ao modelo.</w:t>
       </w:r>
     </w:p>
     <w:p>
@@ -2698,7 +3015,10 @@
     </w:p>
     <w:p>
       <w:r>
-        <w:t xml:space="preserve">A referência completa e interativa da API fica no Swagger, em </w:t>
+        <w:t>A referência complet</w:t>
+      </w:r>
+      <w:r>
+        <w:t xml:space="preserve">a e interativa da API fica no Swagger, em </w:t>
       </w:r>
       <w:r>
         <w:rPr>
@@ -2816,10 +3136,7 @@
           </w:tcPr>
           <w:p>
             <w:r>
-              <w:t>Fun</w:t>
-            </w:r>
-            <w:r>
-              <w:t>cionários</w:t>
+              <w:t>Funcionários</w:t>
             </w:r>
           </w:p>
         </w:tc>
@@ -2841,7 +3158,13 @@
               <w:rPr>
                 <w:rStyle w:val="CodeChar"/>
               </w:rPr>
-              <w:t>POST /funcionario</w:t>
+              <w:t xml:space="preserve">POST </w:t>
+            </w:r>
+            <w:r>
+              <w:rPr>
+                <w:rStyle w:val="CodeChar"/>
+              </w:rPr>
+              <w:t>/funcionario</w:t>
             </w:r>
             <w:r>
               <w:t xml:space="preserve">; </w:t>
@@ -3033,13 +3356,7 @@
               <w:rPr>
                 <w:rStyle w:val="CodeChar"/>
               </w:rPr>
-              <w:t>G</w:t>
-            </w:r>
-            <w:r>
-              <w:rPr>
-                <w:rStyle w:val="CodeChar"/>
-              </w:rPr>
-              <w:t>ET</w:t>
+              <w:t>GET</w:t>
             </w:r>
             <w:r>
               <w:t xml:space="preserve">, </w:t>
@@ -3173,7 +3490,6 @@
         <w:rPr>
           <w:b/>
         </w:rPr>
-        <w:lastRenderedPageBreak/>
         <w:t>Formato dos erros:</w:t>
       </w:r>
       <w:r>
@@ -3183,7 +3499,13 @@
         <w:rPr>
           <w:rStyle w:val="CodeChar"/>
         </w:rPr>
-        <w:t>{ "status": 401, "mensagem": "CPF ou senha inválidos", "dataHora": "..." }</w:t>
+        <w:t>{ "status": 401, "mensagem": "CPF ou senha</w:t>
+      </w:r>
+      <w:r>
+        <w:rPr>
+          <w:rStyle w:val="CodeChar"/>
+        </w:rPr>
+        <w:t xml:space="preserve"> inválidos", "dataHora": "..." }</w:t>
       </w:r>
     </w:p>
     <w:tbl>
@@ -3231,6 +3553,7 @@
           </w:tcPr>
           <w:p>
             <w:r>
+              <w:lastRenderedPageBreak/>
               <w:t>400</w:t>
             </w:r>
           </w:p>
@@ -3241,7 +3564,7 @@
           </w:tcPr>
           <w:p>
             <w:r>
-              <w:t>Dados inválidos (ex.: CPF sem 11 dígitos, venda sem itens)</w:t>
+              <w:t>Dados inválidos (ex.: CPF inválido, venda sem itens, venda com data no futuro, JSON mal formado, id não numérico)</w:t>
             </w:r>
           </w:p>
         </w:tc>
@@ -3307,7 +3630,7 @@
           </w:tcPr>
           <w:p>
             <w:r>
-              <w:t>Registro não encontrado</w:t>
+              <w:t>Registro não encontrado, inclusive ao alterar ou excluir um id que não existe</w:t>
             </w:r>
           </w:p>
         </w:tc>
@@ -3329,7 +3652,32 @@
           </w:tcPr>
           <w:p>
             <w:r>
-              <w:t>Estoque insuficiente ou CPF já cadastrado</w:t>
+              <w:t>Estoque insuficiente, CPF já cadastrado (cliente ou funcionário) ou exclusão de cliente, funcionário ou produto que tem vendas</w:t>
+            </w:r>
+          </w:p>
+        </w:tc>
+      </w:tr>
+      <w:tr>
+        <w:tc>
+          <w:tcPr>
+            <w:tcW w:w="1459" w:type="dxa"/>
+          </w:tcPr>
+          <w:p>
+            <w:r>
+              <w:t>500</w:t>
+            </w:r>
+          </w:p>
+        </w:tc>
+        <w:tc>
+          <w:tcPr>
+            <w:tcW w:w="7900" w:type="dxa"/>
+          </w:tcPr>
+          <w:p>
+            <w:r>
+              <w:t>Erro</w:t>
+            </w:r>
+            <w:r>
+              <w:t xml:space="preserve"> inesperado (mensagem genérica; o detalhe fica no log)</w:t>
             </w:r>
           </w:p>
         </w:tc>
@@ -3367,10 +3715,7 @@
     </w:p>
     <w:p>
       <w:r>
-        <w:t>O sistema registra quem fez cada alteração, guarda o log de todas as requisições e mostra a saúde da API, do b</w:t>
-      </w:r>
-      <w:r>
-        <w:t>anco e do servidor num painel do Grafana.</w:t>
+        <w:t>O sistema registra quem fez cada alteração, guarda o log de todas as requisições e mostra a saúde da API, do banco e do servidor num painel do Grafana.</w:t>
       </w:r>
     </w:p>
     <w:tbl>
@@ -3382,8 +3727,8 @@
       </w:tblPr>
       <w:tblGrid>
         <w:gridCol w:w="1450"/>
-        <w:gridCol w:w="4747"/>
-        <w:gridCol w:w="3163"/>
+        <w:gridCol w:w="4687"/>
+        <w:gridCol w:w="3223"/>
       </w:tblGrid>
       <w:tr>
         <w:trPr>
@@ -3402,7 +3747,7 @@
         </w:tc>
         <w:tc>
           <w:tcPr>
-            <w:tcW w:w="4747" w:type="dxa"/>
+            <w:tcW w:w="4687" w:type="dxa"/>
             <w:shd w:val="clear" w:color="auto" w:fill="F2F2F2"/>
           </w:tcPr>
           <w:p>
@@ -3413,7 +3758,7 @@
         </w:tc>
         <w:tc>
           <w:tcPr>
-            <w:tcW w:w="3163" w:type="dxa"/>
+            <w:tcW w:w="3223" w:type="dxa"/>
             <w:shd w:val="clear" w:color="auto" w:fill="F2F2F2"/>
           </w:tcPr>
           <w:p>
@@ -3436,7 +3781,7 @@
         </w:tc>
         <w:tc>
           <w:tcPr>
-            <w:tcW w:w="4747" w:type="dxa"/>
+            <w:tcW w:w="4687" w:type="dxa"/>
           </w:tcPr>
           <w:p>
             <w:r>
@@ -3446,7 +3791,7 @@
         </w:tc>
         <w:tc>
           <w:tcPr>
-            <w:tcW w:w="3163" w:type="dxa"/>
+            <w:tcW w:w="3223" w:type="dxa"/>
           </w:tcPr>
           <w:p>
             <w:r>
@@ -3468,10 +3813,10 @@
               <w:t>GET /auditoria</w:t>
             </w:r>
             <w:r>
-              <w:t xml:space="preserve"> (Administrador) e tela Auditoria do web, com filtros por ação </w:t>
-            </w:r>
-            <w:r>
-              <w:t>e busca</w:t>
+              <w:t xml:space="preserve"> (Administrador) e telas Auditoria do web e do desktop, com fil</w:t>
+            </w:r>
+            <w:r>
+              <w:t>tros por ação e busca</w:t>
             </w:r>
           </w:p>
         </w:tc>
@@ -3489,7 +3834,7 @@
         </w:tc>
         <w:tc>
           <w:tcPr>
-            <w:tcW w:w="4747" w:type="dxa"/>
+            <w:tcW w:w="4687" w:type="dxa"/>
           </w:tcPr>
           <w:p>
             <w:r>
@@ -3508,7 +3853,7 @@
         </w:tc>
         <w:tc>
           <w:tcPr>
-            <w:tcW w:w="3163" w:type="dxa"/>
+            <w:tcW w:w="3223" w:type="dxa"/>
           </w:tcPr>
           <w:p>
             <w:r>
@@ -3536,20 +3881,17 @@
         </w:tc>
         <w:tc>
           <w:tcPr>
-            <w:tcW w:w="4747" w:type="dxa"/>
-          </w:tcPr>
-          <w:p>
-            <w:r>
-              <w:t>Conexões e comandos que alteram estrutura</w:t>
-            </w:r>
-            <w:r>
-              <w:t>, dados ou permissões</w:t>
-            </w:r>
-          </w:p>
-        </w:tc>
-        <w:tc>
-          <w:tcPr>
-            <w:tcW w:w="3163" w:type="dxa"/>
+            <w:tcW w:w="4687" w:type="dxa"/>
+          </w:tcPr>
+          <w:p>
+            <w:r>
+              <w:t>Conexões e comandos que alteram estrutura, dados ou permissões</w:t>
+            </w:r>
+          </w:p>
+        </w:tc>
+        <w:tc>
+          <w:tcPr>
+            <w:tcW w:w="3223" w:type="dxa"/>
           </w:tcPr>
           <w:p>
             <w:r>
@@ -3586,7 +3928,7 @@
         </w:tc>
         <w:tc>
           <w:tcPr>
-            <w:tcW w:w="4747" w:type="dxa"/>
+            <w:tcW w:w="4687" w:type="dxa"/>
           </w:tcPr>
           <w:p>
             <w:r>
@@ -3596,7 +3938,7 @@
         </w:tc>
         <w:tc>
           <w:tcPr>
-            <w:tcW w:w="3163" w:type="dxa"/>
+            <w:tcW w:w="3223" w:type="dxa"/>
           </w:tcPr>
           <w:p>
             <w:r>
@@ -3606,7 +3948,10 @@
               <w:t>/actuator/prometheus</w:t>
             </w:r>
             <w:r>
-              <w:t>, lido pelo Prometheus</w:t>
+              <w:t>,</w:t>
+            </w:r>
+            <w:r>
+              <w:t xml:space="preserve"> lido pelo Prometheus</w:t>
             </w:r>
           </w:p>
         </w:tc>
@@ -3624,7 +3969,7 @@
         </w:tc>
         <w:tc>
           <w:tcPr>
-            <w:tcW w:w="4747" w:type="dxa"/>
+            <w:tcW w:w="4687" w:type="dxa"/>
           </w:tcPr>
           <w:p>
             <w:r>
@@ -3634,7 +3979,7 @@
         </w:tc>
         <w:tc>
           <w:tcPr>
-            <w:tcW w:w="3163" w:type="dxa"/>
+            <w:tcW w:w="3223" w:type="dxa"/>
           </w:tcPr>
           <w:p>
             <w:r>
@@ -3671,7 +4016,7 @@
         </w:tc>
         <w:tc>
           <w:tcPr>
-            <w:tcW w:w="4747" w:type="dxa"/>
+            <w:tcW w:w="4687" w:type="dxa"/>
           </w:tcPr>
           <w:p>
             <w:r>
@@ -3681,14 +4026,14 @@
         </w:tc>
         <w:tc>
           <w:tcPr>
-            <w:tcW w:w="3163" w:type="dxa"/>
-          </w:tcPr>
-          <w:p>
-            <w:r>
-              <w:t xml:space="preserve">Grafana, painel "Prontê </w:t>
-            </w:r>
-            <w:r>
-              <w:t>- Visão geral"</w:t>
+            <w:tcW w:w="3223" w:type="dxa"/>
+          </w:tcPr>
+          <w:p>
+            <w:r>
+              <w:t>G</w:t>
+            </w:r>
+            <w:r>
+              <w:t>rafana, painel "Prontê - Visão geral"</w:t>
             </w:r>
           </w:p>
         </w:tc>
@@ -3700,13 +4045,14 @@
           </w:tcPr>
           <w:p>
             <w:r>
+              <w:lastRenderedPageBreak/>
               <w:t>Verificação de saúde</w:t>
             </w:r>
           </w:p>
         </w:tc>
         <w:tc>
           <w:tcPr>
-            <w:tcW w:w="4747" w:type="dxa"/>
+            <w:tcW w:w="4687" w:type="dxa"/>
           </w:tcPr>
           <w:p>
             <w:r>
@@ -3716,7 +4062,7 @@
         </w:tc>
         <w:tc>
           <w:tcPr>
-            <w:tcW w:w="3163" w:type="dxa"/>
+            <w:tcW w:w="3223" w:type="dxa"/>
           </w:tcPr>
           <w:p>
             <w:r>
@@ -3742,7 +4088,6 @@
         <w:pStyle w:val="Ttulo3"/>
       </w:pPr>
       <w:r>
-        <w:lastRenderedPageBreak/>
         <w:t>Grafana</w:t>
       </w:r>
     </w:p>
@@ -3880,7 +4225,10 @@
           </w:tcPr>
           <w:p>
             <w:r>
-              <w:t>API, Banco de dados, Tempo no ar da API</w:t>
+              <w:t xml:space="preserve">API, Banco de dados, Tempo </w:t>
+            </w:r>
+            <w:r>
+              <w:t>no ar da API</w:t>
             </w:r>
           </w:p>
         </w:tc>
@@ -3922,10 +4270,7 @@
           </w:tcPr>
           <w:p>
             <w:r>
-              <w:t>Uso do si</w:t>
-            </w:r>
-            <w:r>
-              <w:t>stema, lentidão, falhas e consumo de memória em relação ao máximo de 256 MB</w:t>
+              <w:t>Uso do sistema, lentidão, falhas e consumo de memória em relação ao máximo de 256 MB</w:t>
             </w:r>
           </w:p>
         </w:tc>
@@ -3979,7 +4324,10 @@
           </w:tcPr>
           <w:p>
             <w:r>
-              <w:t>CPU, Memória, Disco</w:t>
+              <w:t>CPU, Memóri</w:t>
+            </w:r>
+            <w:r>
+              <w:t>a, Disco</w:t>
             </w:r>
           </w:p>
         </w:tc>
@@ -4030,7 +4378,10 @@
         <w:t>homologacao</w:t>
       </w:r>
       <w:r>
-        <w:t xml:space="preserve"> na legenda para isolar um ambiente; o painel se atualiza sozinho a cada 30 segundos.</w:t>
+        <w:t xml:space="preserve"> na legenda para isolar </w:t>
+      </w:r>
+      <w:r>
+        <w:t>um ambiente; o painel se atualiza sozinho a cada 30 segundos.</w:t>
       </w:r>
     </w:p>
     <w:p>
@@ -4056,16 +4407,13 @@
         <w:rPr>
           <w:rStyle w:val="CodeChar"/>
         </w:rPr>
-        <w:t>docker compose start api-ho</w:t>
-      </w:r>
-      <w:r>
-        <w:rPr>
-          <w:rStyle w:val="CodeChar"/>
-        </w:rPr>
-        <w:t>mologacao</w:t>
-      </w:r>
-      <w:r>
-        <w:t xml:space="preserve"> volta ao normal.</w:t>
+        <w:t>docker compose start api-homologacao</w:t>
+      </w:r>
+      <w:r>
+        <w:t xml:space="preserve"> volta ao norma</w:t>
+      </w:r>
+      <w:r>
+        <w:t>l.</w:t>
       </w:r>
     </w:p>
     <w:p>
@@ -4092,10 +4440,10 @@
     </w:p>
     <w:p>
       <w:r>
-        <w:t xml:space="preserve">Tudo roda em containers Docker numa VPS </w:t>
-      </w:r>
-      <w:r>
-        <w:t xml:space="preserve">Ubuntu 24.04 no Azure for Students: máquina </w:t>
+        <w:t>Tudo roda em containers Docker numa VPS Ubuntu 24.04 no Azure fo</w:t>
+      </w:r>
+      <w:r>
+        <w:t xml:space="preserve">r Students: máquina </w:t>
       </w:r>
       <w:r>
         <w:rPr>
@@ -4113,19 +4461,17 @@
         <w:t>Canada Central</w:t>
       </w:r>
       <w:r>
-        <w:t xml:space="preserve">. Homologação e produção ficam separadas em containers e bancos próprios. A configuração fica no repositório, em </w:t>
+        <w:t xml:space="preserve">. </w:t>
+      </w:r>
+      <w:r>
+        <w:lastRenderedPageBreak/>
+        <w:t xml:space="preserve">Homologação e produção ficam separadas em containers e bancos próprios. A configuração fica no repositório, em </w:t>
       </w:r>
       <w:r>
         <w:rPr>
           <w:rStyle w:val="CodeChar"/>
         </w:rPr>
-        <w:t>deplo</w:t>
-      </w:r>
-      <w:r>
-        <w:rPr>
-          <w:rStyle w:val="CodeChar"/>
-        </w:rPr>
-        <w:t>y/docker-compose.yml</w:t>
+        <w:t>deploy/docker-compose.yml</w:t>
       </w:r>
       <w:r>
         <w:t>.</w:t>
@@ -4139,8 +4485,8 @@
         <w:tblLook w:val="0420" w:firstRow="1" w:lastRow="0" w:firstColumn="0" w:lastColumn="0" w:noHBand="0" w:noVBand="1"/>
       </w:tblPr>
       <w:tblGrid>
-        <w:gridCol w:w="1895"/>
-        <w:gridCol w:w="4814"/>
+        <w:gridCol w:w="1789"/>
+        <w:gridCol w:w="4920"/>
         <w:gridCol w:w="2651"/>
       </w:tblGrid>
       <w:tr>
@@ -4149,18 +4495,21 @@
         </w:trPr>
         <w:tc>
           <w:tcPr>
-            <w:tcW w:w="1895" w:type="dxa"/>
+            <w:tcW w:w="1789" w:type="dxa"/>
             <w:shd w:val="clear" w:color="auto" w:fill="F2F2F2"/>
           </w:tcPr>
           <w:p>
             <w:r>
-              <w:t>Container</w:t>
-            </w:r>
-          </w:p>
-        </w:tc>
-        <w:tc>
-          <w:tcPr>
-            <w:tcW w:w="4814" w:type="dxa"/>
+              <w:t>Co</w:t>
+            </w:r>
+            <w:r>
+              <w:t>ntainer</w:t>
+            </w:r>
+          </w:p>
+        </w:tc>
+        <w:tc>
+          <w:tcPr>
+            <w:tcW w:w="4920" w:type="dxa"/>
             <w:shd w:val="clear" w:color="auto" w:fill="F2F2F2"/>
           </w:tcPr>
           <w:p>
@@ -4184,7 +4533,7 @@
       <w:tr>
         <w:tc>
           <w:tcPr>
-            <w:tcW w:w="1895" w:type="dxa"/>
+            <w:tcW w:w="1789" w:type="dxa"/>
           </w:tcPr>
           <w:p>
             <w:r>
@@ -4200,15 +4549,11 @@
         </w:tc>
         <w:tc>
           <w:tcPr>
-            <w:tcW w:w="4814" w:type="dxa"/>
-          </w:tcPr>
-          <w:p>
-            <w:r>
-              <w:t xml:space="preserve">Entrada com HTTPS automático; serve o front web </w:t>
-            </w:r>
-            <w:r>
-              <w:lastRenderedPageBreak/>
-              <w:t>de produção e o de homologação</w:t>
+            <w:tcW w:w="4920" w:type="dxa"/>
+          </w:tcPr>
+          <w:p>
+            <w:r>
+              <w:t>Entrada com HTTPS automático; serve o front web e a versão web do mobile, de produção e de homologação</w:t>
             </w:r>
           </w:p>
         </w:tc>
@@ -4218,7 +4563,6 @@
           </w:tcPr>
           <w:p>
             <w:r>
-              <w:lastRenderedPageBreak/>
               <w:t>Sim, portas 80 e 443</w:t>
             </w:r>
           </w:p>
@@ -4227,7 +4571,7 @@
       <w:tr>
         <w:tc>
           <w:tcPr>
-            <w:tcW w:w="1895" w:type="dxa"/>
+            <w:tcW w:w="1789" w:type="dxa"/>
           </w:tcPr>
           <w:p>
             <w:r>
@@ -4240,7 +4584,7 @@
         </w:tc>
         <w:tc>
           <w:tcPr>
-            <w:tcW w:w="4814" w:type="dxa"/>
+            <w:tcW w:w="4920" w:type="dxa"/>
           </w:tcPr>
           <w:p>
             <w:r>
@@ -4268,7 +4612,7 @@
       <w:tr>
         <w:tc>
           <w:tcPr>
-            <w:tcW w:w="1895" w:type="dxa"/>
+            <w:tcW w:w="1789" w:type="dxa"/>
           </w:tcPr>
           <w:p>
             <w:r>
@@ -4281,7 +4625,7 @@
         </w:tc>
         <w:tc>
           <w:tcPr>
-            <w:tcW w:w="4814" w:type="dxa"/>
+            <w:tcW w:w="4920" w:type="dxa"/>
           </w:tcPr>
           <w:p>
             <w:r>
@@ -4309,7 +4653,7 @@
       <w:tr>
         <w:tc>
           <w:tcPr>
-            <w:tcW w:w="1895" w:type="dxa"/>
+            <w:tcW w:w="1789" w:type="dxa"/>
           </w:tcPr>
           <w:p>
             <w:r>
@@ -4325,7 +4669,7 @@
         </w:tc>
         <w:tc>
           <w:tcPr>
-            <w:tcW w:w="4814" w:type="dxa"/>
+            <w:tcW w:w="4920" w:type="dxa"/>
           </w:tcPr>
           <w:p>
             <w:r>
@@ -4347,7 +4691,7 @@
       <w:tr>
         <w:tc>
           <w:tcPr>
-            <w:tcW w:w="1895" w:type="dxa"/>
+            <w:tcW w:w="1789" w:type="dxa"/>
           </w:tcPr>
           <w:p>
             <w:r>
@@ -4360,7 +4704,7 @@
         </w:tc>
         <w:tc>
           <w:tcPr>
-            <w:tcW w:w="4814" w:type="dxa"/>
+            <w:tcW w:w="4920" w:type="dxa"/>
           </w:tcPr>
           <w:p>
             <w:r>
@@ -4382,7 +4726,7 @@
       <w:tr>
         <w:tc>
           <w:tcPr>
-            <w:tcW w:w="1895" w:type="dxa"/>
+            <w:tcW w:w="1789" w:type="dxa"/>
           </w:tcPr>
           <w:p>
             <w:r>
@@ -4395,14 +4739,11 @@
         </w:tc>
         <w:tc>
           <w:tcPr>
-            <w:tcW w:w="4814" w:type="dxa"/>
-          </w:tcPr>
-          <w:p>
-            <w:r>
-              <w:t>Painel de mon</w:t>
-            </w:r>
-            <w:r>
-              <w:t>itoramento</w:t>
+            <w:tcW w:w="4920" w:type="dxa"/>
+          </w:tcPr>
+          <w:p>
+            <w:r>
+              <w:t>Painel de monitoramento</w:t>
             </w:r>
           </w:p>
         </w:tc>
@@ -4420,7 +4761,7 @@
       <w:tr>
         <w:tc>
           <w:tcPr>
-            <w:tcW w:w="1895" w:type="dxa"/>
+            <w:tcW w:w="1789" w:type="dxa"/>
           </w:tcPr>
           <w:p>
             <w:r>
@@ -4442,11 +4783,43 @@
         </w:tc>
         <w:tc>
           <w:tcPr>
-            <w:tcW w:w="4814" w:type="dxa"/>
+            <w:tcW w:w="4920" w:type="dxa"/>
           </w:tcPr>
           <w:p>
             <w:r>
               <w:t>Métricas do MariaDB e da VPS</w:t>
+            </w:r>
+          </w:p>
+        </w:tc>
+        <w:tc>
+          <w:tcPr>
+            <w:tcW w:w="2651" w:type="dxa"/>
+          </w:tcPr>
+          <w:p>
+            <w:r>
+              <w:t>Não</w:t>
+            </w:r>
+          </w:p>
+        </w:tc>
+      </w:tr>
+      <w:tr>
+        <w:tc>
+          <w:tcPr>
+            <w:tcW w:w="1789" w:type="dxa"/>
+          </w:tcPr>
+          <w:p>
+            <w:r>
+              <w:t>backup</w:t>
+            </w:r>
+          </w:p>
+        </w:tc>
+        <w:tc>
+          <w:tcPr>
+            <w:tcW w:w="4920" w:type="dxa"/>
+          </w:tcPr>
+          <w:p>
+            <w:r>
+              <w:t>Backup diário dos bancos de produção e homologação, guardado por 7 dias</w:t>
             </w:r>
           </w:p>
         </w:tc>
@@ -4631,13 +5004,13 @@
         <w:t>Custo:</w:t>
       </w:r>
       <w:r>
-        <w:t xml:space="preserve"> cerca de US$ 0,037 por hora (aproximadamente US$ 27 por mês ligada), descontado do crédito de US$ 100 do</w:t>
-      </w:r>
-      <w:r>
-        <w:t xml:space="preserve"> Azure for Students, sem cartão de crédito. Ao fim do crédito o Azure desativa a assinatura em vez de cobrar. Fora dos períodos de uso a VM pode ser parada pelo portal ("Parar"), o que interrompe o custo da máquina; continuam só o disco e o IP, cerca de US</w:t>
-      </w:r>
-      <w:r>
-        <w:t>$ 5 por mês. Os demais serviços são gratuitos.</w:t>
+        <w:t xml:space="preserve"> cerca de US$ 0,037 por hora (</w:t>
+      </w:r>
+      <w:r>
+        <w:t xml:space="preserve">aproximadamente US$ 27 por mês ligada), descontado do crédito de US$ 100 do Azure for Students, sem cartão de crédito. Ao fim do crédito o Azure desativa a assinatura em vez de cobrar. Fora dos períodos de uso a VM pode ser parada pelo portal ("Parar"), o </w:t>
+      </w:r>
+      <w:r>
+        <w:t>que interrompe o custo da máquina; continuam só o disco e o IP, cerca de US$ 5 por mês. Os demais serviços são gratuitos.</w:t>
       </w:r>
     </w:p>
     <w:p>
@@ -4648,10 +5021,10 @@
         <w:t>Escolha da máquina:</w:t>
       </w:r>
       <w:r>
-        <w:t xml:space="preserve"> a conta de estudante só permite criar recursos em cinco regiões (Mexico Central, France Central, Canada Central, Brazil South e Italy North) e, nelas, os tamanhos x86 mais baratos estavam i</w:t>
-      </w:r>
-      <w:r>
-        <w:t>ndisponíveis. A B2pls_v2, com processador ARM, era a opção disponível mais barata com 4 GiB. Por isso o CD gera a imagem da API para ARM e para x86.</w:t>
+        <w:t xml:space="preserve"> a conta de estudante só permite criar recursos em cinco regiões (Mexico Central, France Central, Canada Central, B</w:t>
+      </w:r>
+      <w:r>
+        <w:t>razil South e Italy North) e, nelas, os tamanhos x86 mais baratos estavam indisponíveis. A B2pls_v2, com processador ARM, era a opção disponível mais barata com 4 GiB. Por isso o CD gera a imagem da API para ARM e para x86.</w:t>
       </w:r>
     </w:p>
     <w:p>
@@ -4668,7 +5041,13 @@
         <w:rPr>
           <w:rStyle w:val="CodeChar"/>
         </w:rPr>
-        <w:t>20.151.6.104</w:t>
+        <w:t>20.15</w:t>
+      </w:r>
+      <w:r>
+        <w:rPr>
+          <w:rStyle w:val="CodeChar"/>
+        </w:rPr>
+        <w:t>1.6.104</w:t>
       </w:r>
       <w:r>
         <w:t>; nomes pelo serviço gratuito sslip.io, com HTTPS válido)</w:t>
@@ -4682,8 +5061,8 @@
         <w:tblLook w:val="0420" w:firstRow="1" w:lastRow="0" w:firstColumn="0" w:lastColumn="0" w:noHBand="0" w:noVBand="1"/>
       </w:tblPr>
       <w:tblGrid>
-        <w:gridCol w:w="3608"/>
-        <w:gridCol w:w="5751"/>
+        <w:gridCol w:w="4297"/>
+        <w:gridCol w:w="5062"/>
       </w:tblGrid>
       <w:tr>
         <w:trPr>
@@ -4691,34 +5070,32 @@
         </w:trPr>
         <w:tc>
           <w:tcPr>
-            <w:tcW w:w="3608" w:type="dxa"/>
+            <w:tcW w:w="4297" w:type="dxa"/>
             <w:shd w:val="clear" w:color="auto" w:fill="F2F2F2"/>
           </w:tcPr>
           <w:p>
             <w:r>
+              <w:lastRenderedPageBreak/>
               <w:t>Serviço</w:t>
             </w:r>
           </w:p>
         </w:tc>
         <w:tc>
           <w:tcPr>
-            <w:tcW w:w="5751" w:type="dxa"/>
+            <w:tcW w:w="5062" w:type="dxa"/>
             <w:shd w:val="clear" w:color="auto" w:fill="F2F2F2"/>
           </w:tcPr>
           <w:p>
             <w:r>
-              <w:t>En</w:t>
-            </w:r>
-            <w:r>
-              <w:t>dereço</w:t>
-            </w:r>
-          </w:p>
-        </w:tc>
-      </w:tr>
-      <w:tr>
-        <w:tc>
-          <w:tcPr>
-            <w:tcW w:w="3608" w:type="dxa"/>
+              <w:t>Endereço</w:t>
+            </w:r>
+          </w:p>
+        </w:tc>
+      </w:tr>
+      <w:tr>
+        <w:tc>
+          <w:tcPr>
+            <w:tcW w:w="4297" w:type="dxa"/>
           </w:tcPr>
           <w:p>
             <w:r>
@@ -4728,7 +5105,7 @@
         </w:tc>
         <w:tc>
           <w:tcPr>
-            <w:tcW w:w="5751" w:type="dxa"/>
+            <w:tcW w:w="5062" w:type="dxa"/>
           </w:tcPr>
           <w:p>
             <w:r>
@@ -4755,7 +5132,7 @@
       <w:tr>
         <w:tc>
           <w:tcPr>
-            <w:tcW w:w="3608" w:type="dxa"/>
+            <w:tcW w:w="4297" w:type="dxa"/>
           </w:tcPr>
           <w:p>
             <w:r>
@@ -4765,7 +5142,7 @@
         </w:tc>
         <w:tc>
           <w:tcPr>
-            <w:tcW w:w="5751" w:type="dxa"/>
+            <w:tcW w:w="5062" w:type="dxa"/>
           </w:tcPr>
           <w:p>
             <w:r>
@@ -4792,18 +5169,17 @@
       <w:tr>
         <w:tc>
           <w:tcPr>
-            <w:tcW w:w="3608" w:type="dxa"/>
-          </w:tcPr>
-          <w:p>
-            <w:r>
-              <w:lastRenderedPageBreak/>
+            <w:tcW w:w="4297" w:type="dxa"/>
+          </w:tcPr>
+          <w:p>
+            <w:r>
               <w:t>Front web de produção</w:t>
             </w:r>
           </w:p>
         </w:tc>
         <w:tc>
           <w:tcPr>
-            <w:tcW w:w="5751" w:type="dxa"/>
+            <w:tcW w:w="5062" w:type="dxa"/>
           </w:tcPr>
           <w:p>
             <w:r>
@@ -4818,7 +5194,7 @@
       <w:tr>
         <w:tc>
           <w:tcPr>
-            <w:tcW w:w="3608" w:type="dxa"/>
+            <w:tcW w:w="4297" w:type="dxa"/>
           </w:tcPr>
           <w:p>
             <w:r>
@@ -4828,7 +5204,7 @@
         </w:tc>
         <w:tc>
           <w:tcPr>
-            <w:tcW w:w="5751" w:type="dxa"/>
+            <w:tcW w:w="5062" w:type="dxa"/>
           </w:tcPr>
           <w:p>
             <w:r>
@@ -4843,7 +5219,51 @@
       <w:tr>
         <w:tc>
           <w:tcPr>
-            <w:tcW w:w="3608" w:type="dxa"/>
+            <w:tcW w:w="4297" w:type="dxa"/>
+          </w:tcPr>
+          <w:p>
+            <w:r>
+              <w:t>Mobile de produção (versão web)</w:t>
+            </w:r>
+          </w:p>
+        </w:tc>
+        <w:tc>
+          <w:tcPr>
+            <w:tcW w:w="5062" w:type="dxa"/>
+          </w:tcPr>
+          <w:p>
+            <w:r>
+              <w:t>https://mobile.20-151-6-104.sslip.io</w:t>
+            </w:r>
+          </w:p>
+        </w:tc>
+      </w:tr>
+      <w:tr>
+        <w:tc>
+          <w:tcPr>
+            <w:tcW w:w="4297" w:type="dxa"/>
+          </w:tcPr>
+          <w:p>
+            <w:r>
+              <w:t>Mobile de homologação (versão web)</w:t>
+            </w:r>
+          </w:p>
+        </w:tc>
+        <w:tc>
+          <w:tcPr>
+            <w:tcW w:w="5062" w:type="dxa"/>
+          </w:tcPr>
+          <w:p>
+            <w:r>
+              <w:t>https://mobile-hml.20-151-6-104.sslip.io</w:t>
+            </w:r>
+          </w:p>
+        </w:tc>
+      </w:tr>
+      <w:tr>
+        <w:tc>
+          <w:tcPr>
+            <w:tcW w:w="4297" w:type="dxa"/>
           </w:tcPr>
           <w:p>
             <w:r>
@@ -4853,7 +5273,7 @@
         </w:tc>
         <w:tc>
           <w:tcPr>
-            <w:tcW w:w="5751" w:type="dxa"/>
+            <w:tcW w:w="5062" w:type="dxa"/>
           </w:tcPr>
           <w:p>
             <w:r>
@@ -4871,7 +5291,7 @@
       <w:tr>
         <w:tc>
           <w:tcPr>
-            <w:tcW w:w="3608" w:type="dxa"/>
+            <w:tcW w:w="4297" w:type="dxa"/>
           </w:tcPr>
           <w:p>
             <w:r>
@@ -4881,7 +5301,7 @@
         </w:tc>
         <w:tc>
           <w:tcPr>
-            <w:tcW w:w="5751" w:type="dxa"/>
+            <w:tcW w:w="5062" w:type="dxa"/>
           </w:tcPr>
           <w:p>
             <w:r>
@@ -4893,35 +5313,60 @@
     </w:tbl>
     <w:p>
       <w:pPr>
-        <w:pStyle w:val="Ttulo2"/>
+        <w:pStyle w:val="Ttulo3"/>
       </w:pPr>
       <w:r>
-        <w:t>10. Processo: versões, CI/CD e testes</w:t>
-      </w:r>
-    </w:p>
-    <w:p>
-      <w:r>
-        <w:t xml:space="preserve">Nenhuma alteração chega à </w:t>
+        <w:t>Backup do banco</w:t>
+      </w:r>
+    </w:p>
+    <w:p>
+      <w:r>
+        <w:t xml:space="preserve">O container </w:t>
       </w:r>
       <w:r>
         <w:rPr>
           <w:rStyle w:val="CodeChar"/>
         </w:rPr>
-        <w:t>main</w:t>
-      </w:r>
-      <w:r>
-        <w:t xml:space="preserve"> sem testes ve</w:t>
-      </w:r>
-      <w:r>
-        <w:t>rdes e aprovação de outro integrante, e nenhuma versão chega à produção sem passar por homologação e por uma segunda aprovação.</w:t>
-      </w:r>
-    </w:p>
-    <w:p>
-      <w:r>
-        <w:rPr>
-          <w:b/>
-        </w:rPr>
-        <w:t>Controle de versões</w:t>
+        <w:t>backup</w:t>
+      </w:r>
+      <w:r>
+        <w:t xml:space="preserve"> faz uma cópia dos bancos </w:t>
+      </w:r>
+      <w:r>
+        <w:rPr>
+          <w:rStyle w:val="CodeChar"/>
+        </w:rPr>
+        <w:t>projeto_producao</w:t>
+      </w:r>
+      <w:r>
+        <w:t xml:space="preserve"> e </w:t>
+      </w:r>
+      <w:r>
+        <w:rPr>
+          <w:rStyle w:val="CodeChar"/>
+        </w:rPr>
+        <w:t>projeto_homologacao</w:t>
+      </w:r>
+      <w:r>
+        <w:t xml:space="preserve"> assim que sobe e depois todo dia às 03:00 (horário de Brasília). Cada banco vira um arquivo compactado em </w:t>
+      </w:r>
+      <w:r>
+        <w:rPr>
+          <w:rStyle w:val="CodeChar"/>
+        </w:rPr>
+        <w:t>deploy/backups/</w:t>
+      </w:r>
+      <w:r>
+        <w:t xml:space="preserve"> (por exemplo </w:t>
+      </w:r>
+      <w:r>
+        <w:rPr>
+          <w:rStyle w:val="CodeChar"/>
+        </w:rPr>
+        <w:t>projeto_producao_2026-10-29_1930.sql.gz</w:t>
+      </w:r>
+      <w:r>
+        <w:t>), e os arquivos com mais de 7 dias são apagados. Os backups ficam fora do GitHub.</w:t>
       </w:r>
     </w:p>
     <w:p>
@@ -4933,43 +5378,31 @@
         </w:numPr>
       </w:pPr>
       <w:r>
-        <w:t xml:space="preserve">Branches: </w:t>
+        <w:rPr>
+          <w:b/>
+        </w:rPr>
+        <w:t>Conferir:</w:t>
+      </w:r>
+      <w:r>
+        <w:t xml:space="preserve"> </w:t>
       </w:r>
       <w:r>
         <w:rPr>
           <w:rStyle w:val="CodeChar"/>
         </w:rPr>
-        <w:t>main</w:t>
-      </w:r>
-      <w:r>
-        <w:t xml:space="preserve"> (versão publicada), </w:t>
+        <w:t>docker compose logs backup</w:t>
+      </w:r>
+      <w:r>
+        <w:t xml:space="preserve"> mostra "backup concluído" para cada banco e o horário do próximo; </w:t>
       </w:r>
       <w:r>
         <w:rPr>
           <w:rStyle w:val="CodeChar"/>
         </w:rPr>
-        <w:t>develop</w:t>
-      </w:r>
-      <w:r>
-        <w:t xml:space="preserve"> (integração) e branches de trabalho </w:t>
-      </w:r>
-      <w:r>
-        <w:rPr>
-          <w:rStyle w:val="CodeChar"/>
-        </w:rPr>
-        <w:t>feature/...</w:t>
-      </w:r>
-      <w:r>
-        <w:t xml:space="preserve"> e </w:t>
-      </w:r>
-      <w:r>
-        <w:rPr>
-          <w:rStyle w:val="CodeChar"/>
-        </w:rPr>
-        <w:t>fix/...</w:t>
-      </w:r>
-      <w:r>
-        <w:t>.</w:t>
+        <w:t>ls -lh backups</w:t>
+      </w:r>
+      <w:r>
+        <w:t xml:space="preserve"> lista os arquivos.</w:t>
       </w:r>
     </w:p>
     <w:p>
@@ -4981,19 +5414,115 @@
         </w:numPr>
       </w:pPr>
       <w:r>
-        <w:t>Toda m</w:t>
-      </w:r>
-      <w:r>
-        <w:t xml:space="preserve">udança entra por pull request; a </w:t>
+        <w:rPr>
+          <w:b/>
+        </w:rPr>
+        <w:t>Backup na hora:</w:t>
+      </w:r>
+      <w:r>
+        <w:t xml:space="preserve"> </w:t>
       </w:r>
       <w:r>
         <w:rPr>
           <w:rStyle w:val="CodeChar"/>
         </w:rPr>
+        <w:t>docker compose resta</w:t>
+      </w:r>
+      <w:r>
+        <w:rPr>
+          <w:rStyle w:val="CodeChar"/>
+        </w:rPr>
+        <w:t>rt backup</w:t>
+      </w:r>
+      <w:r>
+        <w:t>.</w:t>
+      </w:r>
+    </w:p>
+    <w:p>
+      <w:pPr>
+        <w:pStyle w:val="PargrafodaLista"/>
+        <w:numPr>
+          <w:ilvl w:val="0"/>
+          <w:numId w:val="4"/>
+        </w:numPr>
+      </w:pPr>
+      <w:r>
+        <w:rPr>
+          <w:b/>
+        </w:rPr>
+        <w:t>Restaurar:</w:t>
+      </w:r>
+      <w:r>
+        <w:t xml:space="preserve"> </w:t>
+      </w:r>
+      <w:r>
+        <w:rPr>
+          <w:rStyle w:val="CodeChar"/>
+        </w:rPr>
+        <w:t>gunzip -c backups/&lt;arquivo&gt;.sql.gz | docker compose exec -T banco sh -c 'mariadb -uroot -p"$MARIADB_ROOT_PASSWORD"'</w:t>
+      </w:r>
+      <w:r>
+        <w:t xml:space="preserve"> e depois reiniciar a API daquele ambiente. O passo a passo está no README do Projeto-API.</w:t>
+      </w:r>
+    </w:p>
+    <w:p>
+      <w:pPr>
+        <w:pStyle w:val="PargrafodaLista"/>
+        <w:numPr>
+          <w:ilvl w:val="0"/>
+          <w:numId w:val="4"/>
+        </w:numPr>
+      </w:pPr>
+      <w:r>
+        <w:rPr>
+          <w:b/>
+        </w:rPr>
+        <w:t>Cópia fora da VPS:</w:t>
+      </w:r>
+      <w:r>
+        <w:t xml:space="preserve"> </w:t>
+      </w:r>
+      <w:r>
+        <w:rPr>
+          <w:rStyle w:val="CodeChar"/>
+        </w:rPr>
+        <w:t>scp</w:t>
+      </w:r>
+      <w:r>
+        <w:t xml:space="preserve"> do ar</w:t>
+      </w:r>
+      <w:r>
+        <w:t>quivo para outro computador, para não depender só do servidor.</w:t>
+      </w:r>
+    </w:p>
+    <w:p>
+      <w:r>
+        <w:t>Primeira execução em 29/10/2026: os dois bancos foram copiados e o arquivo de produção tinha os dados das 6 tabelas.</w:t>
+      </w:r>
+    </w:p>
+    <w:p>
+      <w:pPr>
+        <w:pStyle w:val="Ttulo2"/>
+      </w:pPr>
+      <w:r>
+        <w:t>10. Processo: versões, CI/CD e testes</w:t>
+      </w:r>
+    </w:p>
+    <w:p>
+      <w:r>
+        <w:t xml:space="preserve">Nenhuma alteração chega à </w:t>
+      </w:r>
+      <w:r>
+        <w:rPr>
+          <w:rStyle w:val="CodeChar"/>
+        </w:rPr>
         <w:t>main</w:t>
       </w:r>
       <w:r>
-        <w:t xml:space="preserve"> é protegida e exige o check "Testes e build" e uma aprovação.</w:t>
+        <w:t xml:space="preserve"> sem tes</w:t>
+      </w:r>
+      <w:r>
+        <w:t>tes verdes e aprovação de outro integrante, e nenhuma versão chega à produção sem passar por homologação e por uma segunda aprovação.</w:t>
       </w:r>
     </w:p>
     <w:p>
@@ -5001,6 +5530,84 @@
         <w:rPr>
           <w:b/>
         </w:rPr>
+        <w:t>Controle de versões</w:t>
+      </w:r>
+    </w:p>
+    <w:p>
+      <w:pPr>
+        <w:pStyle w:val="PargrafodaLista"/>
+        <w:numPr>
+          <w:ilvl w:val="0"/>
+          <w:numId w:val="5"/>
+        </w:numPr>
+      </w:pPr>
+      <w:r>
+        <w:t xml:space="preserve">Branches: </w:t>
+      </w:r>
+      <w:r>
+        <w:rPr>
+          <w:rStyle w:val="CodeChar"/>
+        </w:rPr>
+        <w:t>main</w:t>
+      </w:r>
+      <w:r>
+        <w:t xml:space="preserve"> (versão publicada), </w:t>
+      </w:r>
+      <w:r>
+        <w:rPr>
+          <w:rStyle w:val="CodeChar"/>
+        </w:rPr>
+        <w:t>develop</w:t>
+      </w:r>
+      <w:r>
+        <w:t xml:space="preserve"> (integração) e branches de trabalho </w:t>
+      </w:r>
+      <w:r>
+        <w:rPr>
+          <w:rStyle w:val="CodeChar"/>
+        </w:rPr>
+        <w:t>feature/...</w:t>
+      </w:r>
+      <w:r>
+        <w:t xml:space="preserve"> e </w:t>
+      </w:r>
+      <w:r>
+        <w:rPr>
+          <w:rStyle w:val="CodeChar"/>
+        </w:rPr>
+        <w:t>fix/...</w:t>
+      </w:r>
+      <w:r>
+        <w:t>.</w:t>
+      </w:r>
+    </w:p>
+    <w:p>
+      <w:pPr>
+        <w:pStyle w:val="PargrafodaLista"/>
+        <w:numPr>
+          <w:ilvl w:val="0"/>
+          <w:numId w:val="5"/>
+        </w:numPr>
+      </w:pPr>
+      <w:r>
+        <w:t xml:space="preserve">Toda mudança entra por pull request; a </w:t>
+      </w:r>
+      <w:r>
+        <w:rPr>
+          <w:rStyle w:val="CodeChar"/>
+        </w:rPr>
+        <w:t>main</w:t>
+      </w:r>
+      <w:r>
+        <w:t xml:space="preserve"> é protegida nos repositórios e exige o CI verde e uma aprovação de outro integrante (o autor do PR não pode aprovar o próprio PR).</w:t>
+      </w:r>
+    </w:p>
+    <w:p>
+      <w:r>
+        <w:rPr>
+          <w:b/>
+        </w:rPr>
+        <w:lastRenderedPageBreak/>
         <w:t>Pipeline (GitHub Actions)</w:t>
       </w:r>
     </w:p>
@@ -5080,7 +5687,7 @@
           </w:tcPr>
           <w:p>
             <w:r>
-              <w:t>Compila, roda os 67 testes, confere cobertura ≥ 60% (JaCoCo) e publica o relatório</w:t>
+              <w:t>Compila, roda os 103 testes, confere cobertura de linhas ≥ 90% (JaCoCo) e publica o relatório</w:t>
             </w:r>
           </w:p>
         </w:tc>
@@ -5090,19 +5697,16 @@
           </w:tcPr>
           <w:p>
             <w:r>
-              <w:t xml:space="preserve">Testa de novo, gera a imagem Docker (ARM e x86) no GitHub Container Registry, publica em homologação por SSH, espera a aprovação e publica em produção; confere </w:t>
-            </w:r>
-            <w:r>
-              <w:rPr>
-                <w:rStyle w:val="CodeChar"/>
-              </w:rPr>
-              <w:t>/actuator/hea</w:t>
-            </w:r>
-            <w:r>
-              <w:rPr>
-                <w:rStyle w:val="CodeChar"/>
-              </w:rPr>
-              <w:t>lth</w:t>
+              <w:t>Testa de novo, gera a imagem Docker (ARM e x86) no GitHub Container Registry, publica em homologação por SSH, espera a aprovação e publica em p</w:t>
+            </w:r>
+            <w:r>
+              <w:t xml:space="preserve">rodução; confere </w:t>
+            </w:r>
+            <w:r>
+              <w:rPr>
+                <w:rStyle w:val="CodeChar"/>
+              </w:rPr>
+              <w:t>/actuator/health</w:t>
             </w:r>
             <w:r>
               <w:t xml:space="preserve"> depois de cada deploy</w:t>
@@ -5158,116 +5762,146 @@
               <w:t>deploy/web-homologacao</w:t>
             </w:r>
             <w:r>
+              <w:t>); depois da aprovação, gera apontando para a API de p</w:t>
+            </w:r>
+            <w:r>
+              <w:t xml:space="preserve">rodução e copia para </w:t>
+            </w:r>
+            <w:r>
+              <w:rPr>
+                <w:rStyle w:val="CodeChar"/>
+              </w:rPr>
+              <w:t>deploy/web</w:t>
+            </w:r>
+            <w:r>
+              <w:t>; confere se o site responde</w:t>
+            </w:r>
+          </w:p>
+        </w:tc>
+      </w:tr>
+      <w:tr>
+        <w:tc>
+          <w:tcPr>
+            <w:tcW w:w="2451" w:type="dxa"/>
+          </w:tcPr>
+          <w:p>
+            <w:r>
+              <w:t>Projeto-FrontDesktop</w:t>
+            </w:r>
+          </w:p>
+        </w:tc>
+        <w:tc>
+          <w:tcPr>
+            <w:tcW w:w="1989" w:type="dxa"/>
+          </w:tcPr>
+          <w:p>
+            <w:r>
+              <w:t>Compila e empacota (</w:t>
+            </w:r>
+            <w:r>
+              <w:rPr>
+                <w:rStyle w:val="CodeChar"/>
+              </w:rPr>
+              <w:t>mvnw package</w:t>
+            </w:r>
+            <w:r>
+              <w:t>)</w:t>
+            </w:r>
+          </w:p>
+        </w:tc>
+        <w:tc>
+          <w:tcPr>
+            <w:tcW w:w="4920" w:type="dxa"/>
+          </w:tcPr>
+          <w:p>
+            <w:r>
+              <w:t xml:space="preserve">Gera no Windows o instalador de homologação e publica como </w:t>
+            </w:r>
+            <w:r>
+              <w:rPr>
+                <w:i/>
+              </w:rPr>
+              <w:t>Pre-release</w:t>
+            </w:r>
+            <w:r>
+              <w:t xml:space="preserve">; depois da aprovação, gera o de produção e publica como </w:t>
+            </w:r>
+            <w:r>
+              <w:rPr>
+                <w:i/>
+              </w:rPr>
+              <w:t>Latest</w:t>
+            </w:r>
+            <w:r>
+              <w:t xml:space="preserve"> na pág</w:t>
+            </w:r>
+            <w:r>
+              <w:t>ina de Releases</w:t>
+            </w:r>
+          </w:p>
+        </w:tc>
+      </w:tr>
+      <w:tr>
+        <w:tc>
+          <w:tcPr>
+            <w:tcW w:w="2451" w:type="dxa"/>
+          </w:tcPr>
+          <w:p>
+            <w:r>
+              <w:t>Projeto-FrontMobile</w:t>
+            </w:r>
+          </w:p>
+        </w:tc>
+        <w:tc>
+          <w:tcPr>
+            <w:tcW w:w="1989" w:type="dxa"/>
+          </w:tcPr>
+          <w:p>
+            <w:r>
+              <w:rPr>
+                <w:rStyle w:val="CodeChar"/>
+              </w:rPr>
+              <w:t>npm ci</w:t>
+            </w:r>
+            <w:r>
+              <w:t>, conferência de tipos do TypeScript, pacote JavaScript do Android e versão web (</w:t>
+            </w:r>
+            <w:r>
+              <w:rPr>
+                <w:rStyle w:val="CodeChar"/>
+              </w:rPr>
+              <w:t>expo export</w:t>
+            </w:r>
+            <w:r>
+              <w:t>)</w:t>
+            </w:r>
+          </w:p>
+        </w:tc>
+        <w:tc>
+          <w:tcPr>
+            <w:tcW w:w="4920" w:type="dxa"/>
+          </w:tcPr>
+          <w:p>
+            <w:r>
+              <w:t>Gera a versão web apontando para a API de homologação e copia para a VPS (</w:t>
+            </w:r>
+            <w:r>
+              <w:rPr>
+                <w:rStyle w:val="CodeChar"/>
+              </w:rPr>
+              <w:t>deploy/mobile-homologacao</w:t>
+            </w:r>
+            <w:r>
               <w:t xml:space="preserve">); depois da aprovação, gera apontando para a API de produção e copia para </w:t>
             </w:r>
             <w:r>
               <w:rPr>
                 <w:rStyle w:val="CodeChar"/>
               </w:rPr>
-              <w:t>deploy/we</w:t>
-            </w:r>
-            <w:r>
-              <w:rPr>
-                <w:rStyle w:val="CodeChar"/>
-              </w:rPr>
-              <w:t>b</w:t>
-            </w:r>
-            <w:r>
-              <w:t>; confere se o site responde</w:t>
-            </w:r>
-          </w:p>
-        </w:tc>
-      </w:tr>
-      <w:tr>
-        <w:tc>
-          <w:tcPr>
-            <w:tcW w:w="2451" w:type="dxa"/>
-          </w:tcPr>
-          <w:p>
-            <w:r>
-              <w:t>Projeto-FrontDesktop</w:t>
-            </w:r>
-          </w:p>
-        </w:tc>
-        <w:tc>
-          <w:tcPr>
-            <w:tcW w:w="1989" w:type="dxa"/>
-          </w:tcPr>
-          <w:p>
-            <w:r>
-              <w:t>Compila e empacota (</w:t>
-            </w:r>
-            <w:r>
-              <w:rPr>
-                <w:rStyle w:val="CodeChar"/>
-              </w:rPr>
-              <w:t>mvnw package</w:t>
-            </w:r>
-            <w:r>
-              <w:t>)</w:t>
-            </w:r>
-          </w:p>
-        </w:tc>
-        <w:tc>
-          <w:tcPr>
-            <w:tcW w:w="4920" w:type="dxa"/>
-          </w:tcPr>
-          <w:p>
-            <w:r>
-              <w:t xml:space="preserve">Gera no Windows o instalador de homologação e publica como </w:t>
-            </w:r>
-            <w:r>
-              <w:rPr>
-                <w:i/>
-              </w:rPr>
-              <w:t>Pre-release</w:t>
-            </w:r>
-            <w:r>
-              <w:t xml:space="preserve">; depois da aprovação, gera o de produção e publica como </w:t>
-            </w:r>
-            <w:r>
-              <w:rPr>
-                <w:i/>
-              </w:rPr>
-              <w:t>Latest</w:t>
-            </w:r>
-            <w:r>
-              <w:t xml:space="preserve"> na página de Releases</w:t>
-            </w:r>
-          </w:p>
-        </w:tc>
-      </w:tr>
-      <w:tr>
-        <w:tc>
-          <w:tcPr>
-            <w:tcW w:w="2451" w:type="dxa"/>
-          </w:tcPr>
-          <w:p>
-            <w:r>
-              <w:t>Projeto-Front</w:t>
-            </w:r>
-            <w:r>
-              <w:t>Mobile</w:t>
-            </w:r>
-          </w:p>
-        </w:tc>
-        <w:tc>
-          <w:tcPr>
-            <w:tcW w:w="1989" w:type="dxa"/>
-          </w:tcPr>
-          <w:p>
-            <w:r>
-              <w:t>—</w:t>
-            </w:r>
-          </w:p>
-        </w:tc>
-        <w:tc>
-          <w:tcPr>
-            <w:tcW w:w="4920" w:type="dxa"/>
-          </w:tcPr>
-          <w:p>
-            <w:r>
-              <w:t>— (APK gerado manualmente)</w:t>
+              <w:t>deploy/mobile</w:t>
+            </w:r>
+            <w:r>
+              <w:t>; confere se o aplicativo responde</w:t>
             </w:r>
           </w:p>
         </w:tc>
@@ -5275,7 +5909,7 @@
     </w:tbl>
     <w:p>
       <w:r>
-        <w:t xml:space="preserve">Nos três pipelines o endereço da API de cada ambiente vem de variáveis dos environments </w:t>
+        <w:t xml:space="preserve">Nos quatro pipelines o endereço da API de cada ambiente vem de variáveis dos environments </w:t>
       </w:r>
       <w:r>
         <w:rPr>
@@ -5293,7 +5927,10 @@
         <w:t>producao</w:t>
       </w:r>
       <w:r>
-        <w:t xml:space="preserve"> do GitHub, e o environment </w:t>
+        <w:t xml:space="preserve"> do GitHub, e o envi</w:t>
+      </w:r>
+      <w:r>
+        <w:t xml:space="preserve">ronment </w:t>
       </w:r>
       <w:r>
         <w:rPr>
@@ -5307,8 +5944,10 @@
     </w:p>
     <w:p>
       <w:r>
-        <w:lastRenderedPageBreak/>
-        <w:t>A mesma imagem (identificada pelo commit) vai para homologação e depois para produção, então o que foi validado é exatamente o que vai ao ar.</w:t>
+        <w:t>A mesma imagem (identificada pelo commit) vai para homologação e depois para produção, então o que foi validado é e</w:t>
+      </w:r>
+      <w:r>
+        <w:t>xatamente o que vai ao ar.</w:t>
       </w:r>
     </w:p>
     <w:p>
@@ -5324,7 +5963,7 @@
         <w:pStyle w:val="PargrafodaLista"/>
         <w:numPr>
           <w:ilvl w:val="0"/>
-          <w:numId w:val="5"/>
+          <w:numId w:val="6"/>
         </w:numPr>
       </w:pPr>
       <w:r>
@@ -5346,10 +5985,7 @@
         <w:t>linux/arm64</w:t>
       </w:r>
       <w:r>
-        <w:t xml:space="preserve"> e publicada no GitHub Container Registry, onde</w:t>
-      </w:r>
-      <w:r>
-        <w:t xml:space="preserve"> fica privada. A VPS faz login no registro com um token somente de leitura (</w:t>
+        <w:t xml:space="preserve"> e publicada no GitHub Container Registry, onde fica privada. A VPS faz login no registro com um token somente de leitura (</w:t>
       </w:r>
       <w:r>
         <w:rPr>
@@ -5358,7 +5994,10 @@
         <w:t>read:packages</w:t>
       </w:r>
       <w:r>
-        <w:t>), guardado apenas no servidor.</w:t>
+        <w:t>), guardado apenas no serv</w:t>
+      </w:r>
+      <w:r>
+        <w:t>idor.</w:t>
       </w:r>
     </w:p>
     <w:p>
@@ -5366,7 +6005,7 @@
         <w:pStyle w:val="PargrafodaLista"/>
         <w:numPr>
           <w:ilvl w:val="0"/>
-          <w:numId w:val="5"/>
+          <w:numId w:val="6"/>
         </w:numPr>
       </w:pPr>
       <w:r>
@@ -5406,10 +6045,7 @@
         <w:t>deploy/atualizar.sh</w:t>
       </w:r>
       <w:r>
-        <w:t>, qu</w:t>
-      </w:r>
-      <w:r>
-        <w:t xml:space="preserve">e troca a imagem só do ambiente sendo publicado e registra cada implantação em </w:t>
+        <w:t xml:space="preserve">, que troca a imagem só do ambiente sendo publicado e registra cada implantação em </w:t>
       </w:r>
       <w:r>
         <w:rPr>
@@ -5426,11 +6062,14 @@
         <w:pStyle w:val="PargrafodaLista"/>
         <w:numPr>
           <w:ilvl w:val="0"/>
-          <w:numId w:val="5"/>
+          <w:numId w:val="6"/>
         </w:numPr>
       </w:pPr>
       <w:r>
-        <w:t xml:space="preserve">Os ambientes do GitHub são </w:t>
+        <w:t>Os ambientes do Gi</w:t>
+      </w:r>
+      <w:r>
+        <w:t xml:space="preserve">tHub são </w:t>
       </w:r>
       <w:r>
         <w:rPr>
@@ -5456,14 +6095,27 @@
         <w:pStyle w:val="PargrafodaLista"/>
         <w:numPr>
           <w:ilvl w:val="0"/>
-          <w:numId w:val="5"/>
+          <w:numId w:val="6"/>
         </w:numPr>
       </w:pPr>
       <w:r>
-        <w:t>Primeiras execuções completas em 25/10/2026: API (PR</w:t>
-      </w:r>
-      <w:r>
-        <w:t>s #21 e #22) e front web (PR #21 do Projeto-FrontWeb), com deploy automático em homologação, aprovação por um integrante e deploy em produção.</w:t>
+        <w:lastRenderedPageBreak/>
+        <w:t>Primeiras execuções completas em 25/10/2026: API (PRs #21 e #22) e front web (PR #21 do Projeto-FrontWeb), com deploy automático em homologação, aprovação por um integ</w:t>
+      </w:r>
+      <w:r>
+        <w:t>rante e deploy em produção.</w:t>
+      </w:r>
+    </w:p>
+    <w:p>
+      <w:pPr>
+        <w:pStyle w:val="PargrafodaLista"/>
+        <w:numPr>
+          <w:ilvl w:val="0"/>
+          <w:numId w:val="6"/>
+        </w:numPr>
+      </w:pPr>
+      <w:r>
+        <w:t>O desktop (instaladores v1.3.x) e o mobile (PR #12 do Projeto-FrontMobile, 30/10/2026) passaram a seguir o mesmo fluxo de homologação, aprovação e produção.</w:t>
       </w:r>
     </w:p>
     <w:p>
@@ -5474,10 +6126,10 @@
         <w:t>Testes:</w:t>
       </w:r>
       <w:r>
-        <w:t xml:space="preserve"> a estratégia completa de verificação, validação e teste, com a matriz de rastreabilidade e o roteiro de a</w:t>
-      </w:r>
-      <w:r>
-        <w:t xml:space="preserve">ceitação, está no </w:t>
+        <w:t xml:space="preserve"> a estratégia completa de verificação, validação e teste, com a </w:t>
+      </w:r>
+      <w:r>
+        <w:t xml:space="preserve">matriz de rastreabilidade e o roteiro de aceitação, está no </w:t>
       </w:r>
       <w:hyperlink r:id="rId11" w:history="1">
         <w:r>
@@ -5524,121 +6176,11 @@
         <w:pStyle w:val="PargrafodaLista"/>
         <w:numPr>
           <w:ilvl w:val="0"/>
-          <w:numId w:val="6"/>
+          <w:numId w:val="7"/>
         </w:numPr>
       </w:pPr>
       <w:r>
-        <w:t>Clonar o Projeto-API e abrir o terminal n</w:t>
-      </w:r>
-      <w:r>
-        <w:t>a pasta do projeto.</w:t>
-      </w:r>
-    </w:p>
-    <w:p>
-      <w:pPr>
-        <w:pStyle w:val="PargrafodaLista"/>
-        <w:numPr>
-          <w:ilvl w:val="0"/>
-          <w:numId w:val="6"/>
-        </w:numPr>
-      </w:pPr>
-      <w:r>
-        <w:t xml:space="preserve">Rodar os testes: </w:t>
-      </w:r>
-      <w:r>
-        <w:rPr>
-          <w:rStyle w:val="CodeChar"/>
-        </w:rPr>
-        <w:t>./mvnw verify</w:t>
-      </w:r>
-      <w:r>
-        <w:t xml:space="preserve"> (no Windows, </w:t>
-      </w:r>
-      <w:r>
-        <w:rPr>
-          <w:rStyle w:val="CodeChar"/>
-        </w:rPr>
-        <w:t>.\mvnw.cmd verify</w:t>
-      </w:r>
-      <w:r>
-        <w:t>). Não precisa de MySQL.</w:t>
-      </w:r>
-    </w:p>
-    <w:p>
-      <w:pPr>
-        <w:pStyle w:val="PargrafodaLista"/>
-        <w:numPr>
-          <w:ilvl w:val="0"/>
-          <w:numId w:val="6"/>
-        </w:numPr>
-      </w:pPr>
-      <w:r>
-        <w:t xml:space="preserve">Subir a API: </w:t>
-      </w:r>
-      <w:r>
-        <w:rPr>
-          <w:rStyle w:val="CodeChar"/>
-        </w:rPr>
-        <w:t>./mvnw spring-boot:run</w:t>
-      </w:r>
-      <w:r>
-        <w:t>.</w:t>
-      </w:r>
-    </w:p>
-    <w:p>
-      <w:pPr>
-        <w:pStyle w:val="PargrafodaLista"/>
-        <w:numPr>
-          <w:ilvl w:val="0"/>
-          <w:numId w:val="6"/>
-        </w:numPr>
-      </w:pPr>
-      <w:r>
-        <w:t xml:space="preserve">Abrir </w:t>
-      </w:r>
-      <w:r>
-        <w:rPr>
-          <w:rStyle w:val="CodeChar"/>
-        </w:rPr>
-        <w:t>http://localhost:8080/swagger-ui.html</w:t>
-      </w:r>
-      <w:r>
-        <w:t xml:space="preserve">. Com o banco vazio, o primeiro login é CPF </w:t>
-      </w:r>
-      <w:r>
-        <w:rPr>
-          <w:rStyle w:val="CodeChar"/>
-        </w:rPr>
-        <w:t>00000000000</w:t>
-      </w:r>
-      <w:r>
-        <w:t xml:space="preserve"> e senha </w:t>
-      </w:r>
-      <w:r>
-        <w:rPr>
-          <w:rStyle w:val="CodeChar"/>
-        </w:rPr>
-        <w:t>admin1</w:t>
-      </w:r>
-      <w:r>
-        <w:rPr>
-          <w:rStyle w:val="CodeChar"/>
-        </w:rPr>
-        <w:t>23</w:t>
-      </w:r>
-      <w:r>
-        <w:t xml:space="preserve"> (só em desenvolvimento).</w:t>
-      </w:r>
-    </w:p>
-    <w:p>
-      <w:r>
-        <w:rPr>
-          <w:b/>
-        </w:rPr>
-        <w:t>API na VPS</w:t>
-      </w:r>
-      <w:r>
-        <w:t xml:space="preserve"> (Docker instalado)</w:t>
+        <w:t>Clonar o Projeto-API e abrir o terminal na pasta do projeto.</w:t>
       </w:r>
     </w:p>
     <w:p>
@@ -5650,25 +6192,25 @@
         </w:numPr>
       </w:pPr>
       <w:r>
-        <w:t>Instalar o Docker (</w:t>
+        <w:t xml:space="preserve">Rodar os testes: </w:t>
       </w:r>
       <w:r>
         <w:rPr>
           <w:rStyle w:val="CodeChar"/>
         </w:rPr>
-        <w:t>curl -fsSL https://get.docker.com | sudo sh</w:t>
-      </w:r>
-      <w:r>
-        <w:t>) e liberar o usuário (</w:t>
+        <w:t>./mvnw verify</w:t>
+      </w:r>
+      <w:r>
+        <w:t xml:space="preserve"> (no Windows, </w:t>
       </w:r>
       <w:r>
         <w:rPr>
           <w:rStyle w:val="CodeChar"/>
         </w:rPr>
-        <w:t>sudo usermod -aG docker pronte</w:t>
-      </w:r>
-      <w:r>
-        <w:t>).</w:t>
+        <w:t>.\mvnw.cmd verify</w:t>
+      </w:r>
+      <w:r>
+        <w:t>). Não precisa de MySQL.</w:t>
       </w:r>
     </w:p>
     <w:p>
@@ -5680,19 +6222,13 @@
         </w:numPr>
       </w:pPr>
       <w:r>
+        <w:t xml:space="preserve">Subir a API: </w:t>
+      </w:r>
+      <w:r>
         <w:rPr>
           <w:rStyle w:val="CodeChar"/>
         </w:rPr>
-        <w:t>git clone</w:t>
-      </w:r>
-      <w:r>
-        <w:t xml:space="preserve"> do Projeto-API e entrar em </w:t>
-      </w:r>
-      <w:r>
-        <w:rPr>
-          <w:rStyle w:val="CodeChar"/>
-        </w:rPr>
-        <w:t>deploy/</w:t>
+        <w:t>./mvnw spring-boot:run</w:t>
       </w:r>
       <w:r>
         <w:t>.</w:t>
@@ -5707,37 +6243,48 @@
         </w:numPr>
       </w:pPr>
       <w:r>
-        <w:t xml:space="preserve">Copiar </w:t>
+        <w:t xml:space="preserve">Abrir </w:t>
       </w:r>
       <w:r>
         <w:rPr>
           <w:rStyle w:val="CodeChar"/>
         </w:rPr>
-        <w:t>.env.exemplo</w:t>
-      </w:r>
-      <w:r>
-        <w:t xml:space="preserve"> para </w:t>
+        <w:t>http://localhost:8080/swagger-ui.html</w:t>
+      </w:r>
+      <w:r>
+        <w:t>. Com o banco vazio, o prime</w:t>
+      </w:r>
+      <w:r>
+        <w:t xml:space="preserve">iro login é CPF </w:t>
       </w:r>
       <w:r>
         <w:rPr>
           <w:rStyle w:val="CodeChar"/>
         </w:rPr>
-        <w:t>.env</w:t>
-      </w:r>
-      <w:r>
-        <w:t>, ger</w:t>
-      </w:r>
-      <w:r>
-        <w:t xml:space="preserve">ar as senhas e chaves com </w:t>
+        <w:t>00000000000</w:t>
+      </w:r>
+      <w:r>
+        <w:t xml:space="preserve"> e senha </w:t>
       </w:r>
       <w:r>
         <w:rPr>
           <w:rStyle w:val="CodeChar"/>
         </w:rPr>
-        <w:t>openssl rand -hex</w:t>
-      </w:r>
-      <w:r>
-        <w:t xml:space="preserve"> e preencher os administradores, a chave da Mistral e os endereços.</w:t>
+        <w:t>admin123</w:t>
+      </w:r>
+      <w:r>
+        <w:t xml:space="preserve"> (só em desenvolvimento).</w:t>
+      </w:r>
+    </w:p>
+    <w:p>
+      <w:r>
+        <w:rPr>
+          <w:b/>
+        </w:rPr>
+        <w:t>API na VPS</w:t>
+      </w:r>
+      <w:r>
+        <w:t xml:space="preserve"> (Docker instalado)</w:t>
       </w:r>
     </w:p>
     <w:p>
@@ -5745,20 +6292,29 @@
         <w:pStyle w:val="PargrafodaLista"/>
         <w:numPr>
           <w:ilvl w:val="0"/>
-          <w:numId w:val="7"/>
+          <w:numId w:val="8"/>
         </w:numPr>
       </w:pPr>
       <w:r>
-        <w:t xml:space="preserve">Fazer login no GitHub Container Registry com um token de leitura: </w:t>
+        <w:t>Instalar o Docker (</w:t>
       </w:r>
       <w:r>
         <w:rPr>
           <w:rStyle w:val="CodeChar"/>
         </w:rPr>
-        <w:t>docker login ghcr.io</w:t>
-      </w:r>
-      <w:r>
-        <w:t>.</w:t>
+        <w:t>curl -fsSL https://get.docker.com | sudo sh</w:t>
+      </w:r>
+      <w:r>
+        <w:t>) e liberar o usuário (</w:t>
+      </w:r>
+      <w:r>
+        <w:rPr>
+          <w:rStyle w:val="CodeChar"/>
+        </w:rPr>
+        <w:t>sudo usermod -aG docker pronte</w:t>
+      </w:r>
+      <w:r>
+        <w:t>).</w:t>
       </w:r>
     </w:p>
     <w:p>
@@ -5766,14 +6322,23 @@
         <w:pStyle w:val="PargrafodaLista"/>
         <w:numPr>
           <w:ilvl w:val="0"/>
-          <w:numId w:val="7"/>
+          <w:numId w:val="8"/>
         </w:numPr>
       </w:pPr>
       <w:r>
         <w:rPr>
           <w:rStyle w:val="CodeChar"/>
         </w:rPr>
-        <w:t>docker compose up -d</w:t>
+        <w:t>git clone</w:t>
+      </w:r>
+      <w:r>
+        <w:t xml:space="preserve"> do Projeto-API e entrar em </w:t>
+      </w:r>
+      <w:r>
+        <w:rPr>
+          <w:rStyle w:val="CodeChar"/>
+        </w:rPr>
+        <w:t>deploy/</w:t>
       </w:r>
       <w:r>
         <w:t>.</w:t>
@@ -5784,7 +6349,91 @@
         <w:pStyle w:val="PargrafodaLista"/>
         <w:numPr>
           <w:ilvl w:val="0"/>
-          <w:numId w:val="7"/>
+          <w:numId w:val="8"/>
+        </w:numPr>
+      </w:pPr>
+      <w:r>
+        <w:t xml:space="preserve">Copiar </w:t>
+      </w:r>
+      <w:r>
+        <w:rPr>
+          <w:rStyle w:val="CodeChar"/>
+        </w:rPr>
+        <w:t>.env.exemplo</w:t>
+      </w:r>
+      <w:r>
+        <w:t xml:space="preserve"> para </w:t>
+      </w:r>
+      <w:r>
+        <w:rPr>
+          <w:rStyle w:val="CodeChar"/>
+        </w:rPr>
+        <w:t>.env</w:t>
+      </w:r>
+      <w:r>
+        <w:t xml:space="preserve">, gerar as senhas e chaves com </w:t>
+      </w:r>
+      <w:r>
+        <w:rPr>
+          <w:rStyle w:val="CodeChar"/>
+        </w:rPr>
+        <w:t>openssl rand -hex</w:t>
+      </w:r>
+      <w:r>
+        <w:t xml:space="preserve"> e preencher os administradores, a chave da Mistral e os endereços.</w:t>
+      </w:r>
+    </w:p>
+    <w:p>
+      <w:pPr>
+        <w:pStyle w:val="PargrafodaLista"/>
+        <w:numPr>
+          <w:ilvl w:val="0"/>
+          <w:numId w:val="8"/>
+        </w:numPr>
+      </w:pPr>
+      <w:r>
+        <w:t xml:space="preserve">Fazer login no GitHub Container Registry com um token de leitura: </w:t>
+      </w:r>
+      <w:r>
+        <w:rPr>
+          <w:rStyle w:val="CodeChar"/>
+        </w:rPr>
+        <w:t>docker login ghcr.io</w:t>
+      </w:r>
+      <w:r>
+        <w:t>.</w:t>
+      </w:r>
+    </w:p>
+    <w:p>
+      <w:pPr>
+        <w:pStyle w:val="PargrafodaLista"/>
+        <w:numPr>
+          <w:ilvl w:val="0"/>
+          <w:numId w:val="8"/>
+        </w:numPr>
+      </w:pPr>
+      <w:r>
+        <w:rPr>
+          <w:rStyle w:val="CodeChar"/>
+        </w:rPr>
+        <w:t>docker compose</w:t>
+      </w:r>
+      <w:r>
+        <w:rPr>
+          <w:rStyle w:val="CodeChar"/>
+        </w:rPr>
+        <w:t xml:space="preserve"> up -d</w:t>
+      </w:r>
+      <w:r>
+        <w:t>.</w:t>
+      </w:r>
+    </w:p>
+    <w:p>
+      <w:pPr>
+        <w:pStyle w:val="PargrafodaLista"/>
+        <w:numPr>
+          <w:ilvl w:val="0"/>
+          <w:numId w:val="8"/>
         </w:numPr>
       </w:pPr>
       <w:r>
@@ -5808,8 +6457,8 @@
       </w:tblPr>
       <w:tblGrid>
         <w:gridCol w:w="1147"/>
-        <w:gridCol w:w="4691"/>
-        <w:gridCol w:w="3522"/>
+        <w:gridCol w:w="4920"/>
+        <w:gridCol w:w="3293"/>
       </w:tblGrid>
       <w:tr>
         <w:trPr>
@@ -5828,7 +6477,7 @@
         </w:tc>
         <w:tc>
           <w:tcPr>
-            <w:tcW w:w="4691" w:type="dxa"/>
+            <w:tcW w:w="4920" w:type="dxa"/>
             <w:shd w:val="clear" w:color="auto" w:fill="F2F2F2"/>
           </w:tcPr>
           <w:p>
@@ -5839,7 +6488,7 @@
         </w:tc>
         <w:tc>
           <w:tcPr>
-            <w:tcW w:w="3522" w:type="dxa"/>
+            <w:tcW w:w="3293" w:type="dxa"/>
             <w:shd w:val="clear" w:color="auto" w:fill="F2F2F2"/>
           </w:tcPr>
           <w:p>
@@ -5862,7 +6511,7 @@
         </w:tc>
         <w:tc>
           <w:tcPr>
-            <w:tcW w:w="4691" w:type="dxa"/>
+            <w:tcW w:w="4920" w:type="dxa"/>
           </w:tcPr>
           <w:p>
             <w:r>
@@ -5881,13 +6530,179 @@
               <w:rPr>
                 <w:rStyle w:val="CodeChar"/>
               </w:rPr>
-              <w:t>https://web-hml.20-15</w:t>
-            </w:r>
-            <w:r>
-              <w:rPr>
-                <w:rStyle w:val="CodeChar"/>
-              </w:rPr>
-              <w:t>1-6-104.sslip.io</w:t>
+              <w:t>https://web-h</w:t>
+            </w:r>
+            <w:r>
+              <w:rPr>
+                <w:rStyle w:val="CodeChar"/>
+              </w:rPr>
+              <w:t>ml.20-151-6-104.sslip.io</w:t>
+            </w:r>
+            <w:r>
+              <w:t xml:space="preserve">. Para desenvolver: </w:t>
+            </w:r>
+            <w:r>
+              <w:rPr>
+                <w:rStyle w:val="CodeChar"/>
+              </w:rPr>
+              <w:t>npm install</w:t>
+            </w:r>
+            <w:r>
+              <w:t xml:space="preserve"> e </w:t>
+            </w:r>
+            <w:r>
+              <w:rPr>
+                <w:rStyle w:val="CodeChar"/>
+              </w:rPr>
+              <w:t>npm run dev</w:t>
+            </w:r>
+          </w:p>
+        </w:tc>
+        <w:tc>
+          <w:tcPr>
+            <w:tcW w:w="3293" w:type="dxa"/>
+          </w:tcPr>
+          <w:p>
+            <w:r>
+              <w:t xml:space="preserve">Definido pelo CD em cada ambiente; localmente, </w:t>
+            </w:r>
+            <w:r>
+              <w:rPr>
+                <w:rStyle w:val="CodeChar"/>
+              </w:rPr>
+              <w:t>.env</w:t>
+            </w:r>
+            <w:r>
+              <w:t xml:space="preserve"> (</w:t>
+            </w:r>
+            <w:r>
+              <w:rPr>
+                <w:rStyle w:val="CodeChar"/>
+              </w:rPr>
+              <w:t>localhost</w:t>
+            </w:r>
+            <w:r>
+              <w:t xml:space="preserve">) no desenvolvimento e </w:t>
+            </w:r>
+            <w:r>
+              <w:rPr>
+                <w:rStyle w:val="CodeChar"/>
+              </w:rPr>
+              <w:t>.env.production</w:t>
+            </w:r>
+            <w:r>
+              <w:t xml:space="preserve"> no build</w:t>
+            </w:r>
+          </w:p>
+        </w:tc>
+      </w:tr>
+      <w:tr>
+        <w:tc>
+          <w:tcPr>
+            <w:tcW w:w="1147" w:type="dxa"/>
+          </w:tcPr>
+          <w:p>
+            <w:r>
+              <w:t>Desktop</w:t>
+            </w:r>
+          </w:p>
+        </w:tc>
+        <w:tc>
+          <w:tcPr>
+            <w:tcW w:w="4920" w:type="dxa"/>
+          </w:tcPr>
+          <w:p>
+            <w:r>
+              <w:t xml:space="preserve">Baixar o </w:t>
+            </w:r>
+            <w:r>
+              <w:rPr>
+                <w:rStyle w:val="CodeChar"/>
+              </w:rPr>
+              <w:t>.exe</w:t>
+            </w:r>
+            <w:r>
+              <w:t xml:space="preserve"> da versão </w:t>
+            </w:r>
+            <w:r>
+              <w:rPr>
+                <w:i/>
+              </w:rPr>
+              <w:t>Latest</w:t>
+            </w:r>
+            <w:r>
+              <w:t xml:space="preserve"> (produção) ou da </w:t>
+            </w:r>
+            <w:r>
+              <w:rPr>
+                <w:i/>
+              </w:rPr>
+              <w:t>Pre-release</w:t>
+            </w:r>
+            <w:r>
+              <w:t xml:space="preserve"> (homologação) na página de Releases do Projeto-FrontDesktop e executar. Desinstalar antes a versão 1.2.0 antiga</w:t>
+            </w:r>
+          </w:p>
+        </w:tc>
+        <w:tc>
+          <w:tcPr>
+            <w:tcW w:w="3293" w:type="dxa"/>
+          </w:tcPr>
+          <w:p>
+            <w:r>
+              <w:t xml:space="preserve">Já vem no </w:t>
+            </w:r>
+            <w:r>
+              <w:rPr>
+                <w:rStyle w:val="CodeChar"/>
+              </w:rPr>
+              <w:t>api.properties</w:t>
+            </w:r>
+            <w:r>
+              <w:t xml:space="preserve"> de cada instalador</w:t>
+            </w:r>
+          </w:p>
+        </w:tc>
+      </w:tr>
+      <w:tr>
+        <w:tc>
+          <w:tcPr>
+            <w:tcW w:w="1147" w:type="dxa"/>
+          </w:tcPr>
+          <w:p>
+            <w:r>
+              <w:t>Mobile</w:t>
+            </w:r>
+          </w:p>
+        </w:tc>
+        <w:tc>
+          <w:tcPr>
+            <w:tcW w:w="4920" w:type="dxa"/>
+          </w:tcPr>
+          <w:p>
+            <w:r>
+              <w:t xml:space="preserve">Abrir no navegador do celular ou do computador: produção em </w:t>
+            </w:r>
+            <w:r>
+              <w:rPr>
+                <w:rStyle w:val="CodeChar"/>
+              </w:rPr>
+              <w:t>https://mobile.20-151-6-104.ssl</w:t>
+            </w:r>
+            <w:r>
+              <w:rPr>
+                <w:rStyle w:val="CodeChar"/>
+              </w:rPr>
+              <w:t>ip.io</w:t>
+            </w:r>
+            <w:r>
+              <w:t xml:space="preserve">, homologação em </w:t>
+            </w:r>
+            <w:r>
+              <w:rPr>
+                <w:rStyle w:val="CodeChar"/>
+              </w:rPr>
+              <w:t>https://mobile-hml.20-151-6-104.sslip.io</w:t>
             </w:r>
             <w:r>
               <w:t xml:space="preserve">. Para desenvolver: </w:t>
@@ -5906,18 +6721,30 @@
               <w:rPr>
                 <w:rStyle w:val="CodeChar"/>
               </w:rPr>
-              <w:t>npm run dev</w:t>
-            </w:r>
-          </w:p>
-        </w:tc>
-        <w:tc>
-          <w:tcPr>
-            <w:tcW w:w="3522" w:type="dxa"/>
+              <w:t>npm run web</w:t>
+            </w:r>
+            <w:r>
+              <w:t xml:space="preserve"> (ou o Expo Go no celular)</w:t>
+            </w:r>
+          </w:p>
+        </w:tc>
+        <w:tc>
+          <w:tcPr>
+            <w:tcW w:w="3293" w:type="dxa"/>
           </w:tcPr>
           <w:p>
             <w:r>
               <w:lastRenderedPageBreak/>
-              <w:t xml:space="preserve">Definido pelo CD em cada ambiente; localmente, </w:t>
+              <w:t>Definido pelo CD (</w:t>
+            </w:r>
+            <w:r>
+              <w:rPr>
+                <w:rStyle w:val="CodeChar"/>
+              </w:rPr>
+              <w:t>EXPO_PUBLIC_API_URL</w:t>
+            </w:r>
+            <w:r>
+              <w:t xml:space="preserve">) em cada ambiente; localmente, no </w:t>
             </w:r>
             <w:r>
               <w:rPr>
@@ -5925,157 +6752,16 @@
               </w:rPr>
               <w:t>.env</w:t>
             </w:r>
-            <w:r>
-              <w:t xml:space="preserve"> (</w:t>
-            </w:r>
-            <w:r>
-              <w:rPr>
-                <w:rStyle w:val="CodeChar"/>
-              </w:rPr>
-              <w:t>localhost</w:t>
-            </w:r>
-            <w:r>
-              <w:t xml:space="preserve">) no desenvolvimento e </w:t>
-            </w:r>
-            <w:r>
-              <w:rPr>
-                <w:rStyle w:val="CodeChar"/>
-              </w:rPr>
-              <w:lastRenderedPageBreak/>
-              <w:t>.env.production</w:t>
-            </w:r>
-            <w:r>
-              <w:t xml:space="preserve"> no build</w:t>
-            </w:r>
-          </w:p>
-        </w:tc>
-      </w:tr>
-      <w:tr>
-        <w:tc>
-          <w:tcPr>
-            <w:tcW w:w="1147" w:type="dxa"/>
-          </w:tcPr>
-          <w:p>
-            <w:r>
-              <w:lastRenderedPageBreak/>
-              <w:t>Desktop</w:t>
-            </w:r>
-          </w:p>
-        </w:tc>
-        <w:tc>
-          <w:tcPr>
-            <w:tcW w:w="4691" w:type="dxa"/>
-          </w:tcPr>
-          <w:p>
-            <w:r>
-              <w:t xml:space="preserve">Baixar o </w:t>
-            </w:r>
-            <w:r>
-              <w:rPr>
-                <w:rStyle w:val="CodeChar"/>
-              </w:rPr>
-              <w:t>.exe</w:t>
-            </w:r>
-            <w:r>
-              <w:t xml:space="preserve"> da versão </w:t>
-            </w:r>
-            <w:r>
-              <w:rPr>
-                <w:i/>
-              </w:rPr>
-              <w:t>Latest</w:t>
-            </w:r>
-            <w:r>
-              <w:t xml:space="preserve"> (produção) ou da </w:t>
-            </w:r>
-            <w:r>
-              <w:rPr>
-                <w:i/>
-              </w:rPr>
-              <w:t>Pre-release</w:t>
-            </w:r>
-            <w:r>
-              <w:t xml:space="preserve"> (homologação) n</w:t>
-            </w:r>
-            <w:r>
-              <w:t>a página de Releases do Projeto-FrontDesktop e executar. Desinstalar antes a versão 1.2.0 antiga</w:t>
-            </w:r>
-          </w:p>
-        </w:tc>
-        <w:tc>
-          <w:tcPr>
-            <w:tcW w:w="3522" w:type="dxa"/>
-          </w:tcPr>
-          <w:p>
-            <w:r>
-              <w:t xml:space="preserve">Já vem no </w:t>
-            </w:r>
-            <w:r>
-              <w:rPr>
-                <w:rStyle w:val="CodeChar"/>
-              </w:rPr>
-              <w:t>api.properties</w:t>
-            </w:r>
-            <w:r>
-              <w:t xml:space="preserve"> de cada instalador</w:t>
-            </w:r>
-          </w:p>
-        </w:tc>
-      </w:tr>
-      <w:tr>
-        <w:tc>
-          <w:tcPr>
-            <w:tcW w:w="1147" w:type="dxa"/>
-          </w:tcPr>
-          <w:p>
-            <w:r>
-              <w:t>Mobile</w:t>
-            </w:r>
-          </w:p>
-        </w:tc>
-        <w:tc>
-          <w:tcPr>
-            <w:tcW w:w="4691" w:type="dxa"/>
-          </w:tcPr>
-          <w:p>
-            <w:r>
-              <w:t>Instalar o APK no Android</w:t>
-            </w:r>
-          </w:p>
-        </w:tc>
-        <w:tc>
-          <w:tcPr>
-            <w:tcW w:w="3522" w:type="dxa"/>
-          </w:tcPr>
-          <w:p>
-            <w:r>
-              <w:t xml:space="preserve">Variável </w:t>
-            </w:r>
-            <w:r>
-              <w:rPr>
-                <w:rStyle w:val="CodeChar"/>
-              </w:rPr>
-              <w:t>EXPO_PUBLIC_API_URL=https://api.20-151-6-104.sslip.io</w:t>
-            </w:r>
-            <w:r>
-              <w:t xml:space="preserve"> no </w:t>
-            </w:r>
-            <w:r>
-              <w:rPr>
-                <w:rStyle w:val="CodeChar"/>
-              </w:rPr>
-              <w:t>.env</w:t>
-            </w:r>
-            <w:r>
-              <w:t>, antes de gerar o APK</w:t>
-            </w:r>
           </w:p>
         </w:tc>
       </w:tr>
     </w:tbl>
     <w:p>
       <w:r>
-        <w:t>Em aberto: geração e link do APK do mobile apontando para a produção.</w:t>
+        <w:t>O APK do Android não é gerado pelo pipeline:</w:t>
+      </w:r>
+      <w:r>
+        <w:t xml:space="preserve"> o CI confere que o código compila para o Android, e o mesmo código pode ser empacotado depois com o EAS Build.</w:t>
       </w:r>
     </w:p>
     <w:p>
@@ -6088,7 +6774,10 @@
     </w:p>
     <w:p>
       <w:r>
-        <w:t>A gestão do trabalho fica no GitHub, junto do código, para que cada tarefa aponte para o PR que a resolveu.</w:t>
+        <w:t xml:space="preserve">A gestão do trabalho fica no GitHub, junto do código, para que cada tarefa aponte para o PR que </w:t>
+      </w:r>
+      <w:r>
+        <w:t>a resolveu.</w:t>
       </w:r>
     </w:p>
     <w:p>
@@ -6096,20 +6785,14 @@
         <w:pStyle w:val="PargrafodaLista"/>
         <w:numPr>
           <w:ilvl w:val="0"/>
-          <w:numId w:val="8"/>
+          <w:numId w:val="9"/>
         </w:numPr>
       </w:pPr>
       <w:r>
         <w:rPr>
           <w:b/>
         </w:rPr>
-        <w:t>Quadro</w:t>
-      </w:r>
-      <w:r>
-        <w:rPr>
-          <w:b/>
-        </w:rPr>
-        <w:t xml:space="preserve"> (GitHub Projects):</w:t>
+        <w:t>Quadro (GitHub Projects):</w:t>
       </w:r>
       <w:r>
         <w:t xml:space="preserve"> colunas A fazer, Em andamento, Em revisão e Concluído, com uma issue por tarefa, responsável e marco (V0, Entrega final).</w:t>
@@ -6120,7 +6803,7 @@
         <w:pStyle w:val="PargrafodaLista"/>
         <w:numPr>
           <w:ilvl w:val="0"/>
-          <w:numId w:val="8"/>
+          <w:numId w:val="9"/>
         </w:numPr>
       </w:pPr>
       <w:r>
@@ -6130,7 +6813,10 @@
         <w:t>Pull requests:</w:t>
       </w:r>
       <w:r>
-        <w:t xml:space="preserve"> registram quem fez, quem revisou e quando entrou cada mudança (#1 a #20 no Projeto-API).</w:t>
+        <w:t xml:space="preserve"> registram quem fez, quem revisou e quando entrou cada mudança (mais de 30 no Proj</w:t>
+      </w:r>
+      <w:r>
+        <w:t>eto-API, além dos PRs de cada front).</w:t>
       </w:r>
     </w:p>
     <w:p>
@@ -6138,7 +6824,7 @@
         <w:pStyle w:val="PargrafodaLista"/>
         <w:numPr>
           <w:ilvl w:val="0"/>
-          <w:numId w:val="8"/>
+          <w:numId w:val="9"/>
         </w:numPr>
       </w:pPr>
       <w:r>
@@ -6148,10 +6834,7 @@
         <w:t>Defeitos:</w:t>
       </w:r>
       <w:r>
-        <w:t xml:space="preserve"> </w:t>
-      </w:r>
-      <w:r>
-        <w:t xml:space="preserve">issues com o rótulo </w:t>
+        <w:t xml:space="preserve"> issues com o rótulo </w:t>
       </w:r>
       <w:r>
         <w:rPr>
@@ -6297,7 +6980,10 @@
           </w:tcPr>
           <w:p>
             <w:r>
-              <w:t>Contrato da API, sempre atualizado com o código</w:t>
+              <w:t xml:space="preserve">Contrato da API, sempre atualizado com </w:t>
+            </w:r>
+            <w:r>
+              <w:t>o código</w:t>
             </w:r>
           </w:p>
         </w:tc>
@@ -6342,10 +7028,10 @@
 <file path=word/numbering.xml><?xml version="1.0" encoding="utf-8"?>
 <w:numbering xmlns:wpc="http://schemas.microsoft.com/office/word/2010/wordprocessingCanvas" xmlns:cx="http://schemas.microsoft.com/office/drawing/2014/chartex" xmlns:cx1="http://schemas.microsoft.com/office/drawing/2015/9/8/chartex" xmlns:cx2="http://schemas.microsoft.com/office/drawing/2015/10/21/chartex" xmlns:cx3="http://schemas.microsoft.com/office/drawing/2016/5/9/chartex" xmlns:cx4="http://schemas.microsoft.com/office/drawing/2016/5/10/chartex" xmlns:cx5="http://schemas.microsoft.com/office/drawing/2016/5/11/chartex" xmlns:cx6="http://schemas.microsoft.com/office/drawing/2016/5/12/chartex" xmlns:cx7="http://schemas.microsoft.com/office/drawing/2016/5/13/chartex" xmlns:cx8="http://schemas.microsoft.com/office/drawing/2016/5/14/chartex" xmlns:mc="http://schemas.openxmlformats.org/markup-compatibility/2006" xmlns:aink="http://schemas.microsoft.com/office/drawing/2016/ink" xmlns:am3d="http://schemas.microsoft.com/office/drawing/2017/model3d" xmlns:o="urn:schemas-microsoft-com:office:office" xmlns:r="http://schemas.openxmlformats.org/officeDocument/2006/relationships" xmlns:m="http://schemas.openxmlformats.org/officeDocument/2006/math" xmlns:v="urn:schemas-microsoft-com:vml" xmlns:wp14="http://schemas.microsoft.com/office/word/2010/wordprocessingDrawing" xmlns:wp="http://schemas.openxmlformats.org/drawingml/2006/wordprocessingDrawing" xmlns:w10="urn:schemas-microsoft-com:office:word" xmlns:w="http://schemas.openxmlformats.org/wordprocessingml/2006/main" xmlns:w14="http://schemas.microsoft.com/office/word/2010/wordml" xmlns:w15="http://schemas.microsoft.com/office/word/2012/wordml" xmlns:w16cid="http://schemas.microsoft.com/office/word/2016/wordml/cid" xmlns:w16se="http://schemas.microsoft.com/office/word/2015/wordml/symex" xmlns:wpg="http://schemas.microsoft.com/office/word/2010/wordprocessingGroup" xmlns:wpi="http://schemas.microsoft.com/office/word/2010/wordprocessingInk" xmlns:wne="http://schemas.microsoft.com/office/word/2006/wordml" xmlns:wps="http://schemas.microsoft.com/office/word/2010/wordprocessingShape" mc:Ignorable="w14 w15 w16se w16cid wp14">
   <w:abstractNum w:abstractNumId="0" w15:restartNumberingAfterBreak="0">
-    <w:nsid w:val="29696E09"/>
+    <w:nsid w:val="01EC5776"/>
     <w:multiLevelType w:val="hybridMultilevel"/>
-    <w:tmpl w:val="5560C620"/>
-    <w:lvl w:ilvl="0" w:tplc="2EF02972">
+    <w:tmpl w:val="1DD858B8"/>
+    <w:lvl w:ilvl="0" w:tplc="03A651FA">
       <w:start w:val="1"/>
       <w:numFmt w:val="decimal"/>
       <w:lvlText w:val="%1."/>
@@ -6354,7 +7040,7 @@
         <w:ind w:left="720" w:hanging="360"/>
       </w:pPr>
     </w:lvl>
-    <w:lvl w:ilvl="1" w:tplc="60F63388">
+    <w:lvl w:ilvl="1" w:tplc="79367932">
       <w:start w:val="1"/>
       <w:numFmt w:val="lowerLetter"/>
       <w:lvlText w:val="%2."/>
@@ -6363,7 +7049,7 @@
         <w:ind w:left="1440" w:hanging="360"/>
       </w:pPr>
     </w:lvl>
-    <w:lvl w:ilvl="2" w:tplc="505A0278">
+    <w:lvl w:ilvl="2" w:tplc="0A1C0F90">
       <w:start w:val="1"/>
       <w:numFmt w:val="lowerRoman"/>
       <w:lvlText w:val="%3."/>
@@ -6372,7 +7058,7 @@
         <w:ind w:left="2160" w:hanging="360"/>
       </w:pPr>
     </w:lvl>
-    <w:lvl w:ilvl="3" w:tplc="0EA2A372">
+    <w:lvl w:ilvl="3" w:tplc="71A65842">
       <w:start w:val="1"/>
       <w:numFmt w:val="decimal"/>
       <w:lvlText w:val="%4."/>
@@ -6381,7 +7067,7 @@
         <w:ind w:left="2880" w:hanging="360"/>
       </w:pPr>
     </w:lvl>
-    <w:lvl w:ilvl="4" w:tplc="F2F427D4">
+    <w:lvl w:ilvl="4" w:tplc="4F025346">
       <w:start w:val="1"/>
       <w:numFmt w:val="lowerLetter"/>
       <w:lvlText w:val="%5."/>
@@ -6390,7 +7076,7 @@
         <w:ind w:left="3600" w:hanging="360"/>
       </w:pPr>
     </w:lvl>
-    <w:lvl w:ilvl="5" w:tplc="40B60C3A">
+    <w:lvl w:ilvl="5" w:tplc="2A28B3A4">
       <w:start w:val="1"/>
       <w:numFmt w:val="lowerRoman"/>
       <w:lvlText w:val="%6."/>
@@ -6399,7 +7085,7 @@
         <w:ind w:left="4320" w:hanging="360"/>
       </w:pPr>
     </w:lvl>
-    <w:lvl w:ilvl="6" w:tplc="91CCC5D6">
+    <w:lvl w:ilvl="6" w:tplc="0BD69260">
       <w:start w:val="1"/>
       <w:numFmt w:val="decimal"/>
       <w:lvlText w:val="%7."/>
@@ -6408,7 +7094,7 @@
         <w:ind w:left="5040" w:hanging="360"/>
       </w:pPr>
     </w:lvl>
-    <w:lvl w:ilvl="7" w:tplc="5610F88A">
+    <w:lvl w:ilvl="7" w:tplc="06E00446">
       <w:start w:val="1"/>
       <w:numFmt w:val="lowerLetter"/>
       <w:lvlText w:val="%8."/>
@@ -6417,7 +7103,7 @@
         <w:ind w:left="5760" w:hanging="360"/>
       </w:pPr>
     </w:lvl>
-    <w:lvl w:ilvl="8" w:tplc="7C6A940C">
+    <w:lvl w:ilvl="8" w:tplc="429A6800">
       <w:start w:val="1"/>
       <w:numFmt w:val="lowerRoman"/>
       <w:lvlText w:val="%9."/>
@@ -6428,10 +7114,10 @@
     </w:lvl>
   </w:abstractNum>
   <w:abstractNum w:abstractNumId="1" w15:restartNumberingAfterBreak="0">
-    <w:nsid w:val="4F715C93"/>
+    <w:nsid w:val="519F06D0"/>
     <w:multiLevelType w:val="hybridMultilevel"/>
-    <w:tmpl w:val="86AAA218"/>
-    <w:lvl w:ilvl="0" w:tplc="EE302722">
+    <w:tmpl w:val="068201AC"/>
+    <w:lvl w:ilvl="0" w:tplc="8E1E9450">
       <w:start w:val="1"/>
       <w:numFmt w:val="bullet"/>
       <w:lvlText w:val="•"/>
@@ -6440,7 +7126,7 @@
         <w:ind w:left="720" w:hanging="360"/>
       </w:pPr>
     </w:lvl>
-    <w:lvl w:ilvl="1" w:tplc="8A52E3B0">
+    <w:lvl w:ilvl="1" w:tplc="4A786BDC">
       <w:start w:val="1"/>
       <w:numFmt w:val="bullet"/>
       <w:lvlText w:val="o"/>
@@ -6449,7 +7135,7 @@
         <w:ind w:left="1440" w:hanging="360"/>
       </w:pPr>
     </w:lvl>
-    <w:lvl w:ilvl="2" w:tplc="90209B18">
+    <w:lvl w:ilvl="2" w:tplc="43FC9ED6">
       <w:start w:val="1"/>
       <w:numFmt w:val="bullet"/>
       <w:lvlText w:val="▪"/>
@@ -6458,7 +7144,7 @@
         <w:ind w:left="2160" w:hanging="360"/>
       </w:pPr>
     </w:lvl>
-    <w:lvl w:ilvl="3" w:tplc="7CBCB3E0">
+    <w:lvl w:ilvl="3" w:tplc="28BC0444">
       <w:start w:val="1"/>
       <w:numFmt w:val="bullet"/>
       <w:lvlText w:val="•"/>
@@ -6467,7 +7153,7 @@
         <w:ind w:left="2880" w:hanging="360"/>
       </w:pPr>
     </w:lvl>
-    <w:lvl w:ilvl="4" w:tplc="0C72EFD0">
+    <w:lvl w:ilvl="4" w:tplc="277C4BDE">
       <w:start w:val="1"/>
       <w:numFmt w:val="bullet"/>
       <w:lvlText w:val="o"/>
@@ -6476,7 +7162,7 @@
         <w:ind w:left="3600" w:hanging="360"/>
       </w:pPr>
     </w:lvl>
-    <w:lvl w:ilvl="5" w:tplc="82A6B022">
+    <w:lvl w:ilvl="5" w:tplc="ECCC0562">
       <w:start w:val="1"/>
       <w:numFmt w:val="bullet"/>
       <w:lvlText w:val="▪"/>
@@ -6485,7 +7171,7 @@
         <w:ind w:left="4320" w:hanging="360"/>
       </w:pPr>
     </w:lvl>
-    <w:lvl w:ilvl="6" w:tplc="8744B356">
+    <w:lvl w:ilvl="6" w:tplc="BAD069C2">
       <w:start w:val="1"/>
       <w:numFmt w:val="bullet"/>
       <w:lvlText w:val="•"/>
@@ -6494,7 +7180,7 @@
         <w:ind w:left="5040" w:hanging="360"/>
       </w:pPr>
     </w:lvl>
-    <w:lvl w:ilvl="7" w:tplc="6C16E53C">
+    <w:lvl w:ilvl="7" w:tplc="9A482630">
       <w:start w:val="1"/>
       <w:numFmt w:val="bullet"/>
       <w:lvlText w:val="o"/>
@@ -6503,7 +7189,7 @@
         <w:ind w:left="5760" w:hanging="360"/>
       </w:pPr>
     </w:lvl>
-    <w:lvl w:ilvl="8" w:tplc="B7F4B56A">
+    <w:lvl w:ilvl="8" w:tplc="42ECBD76">
       <w:start w:val="1"/>
       <w:numFmt w:val="bullet"/>
       <w:lvlText w:val="▪"/>
@@ -6532,10 +7218,7 @@
     <w:abstractNumId w:val="1"/>
   </w:num>
   <w:num w:numId="6">
-    <w:abstractNumId w:val="0"/>
-    <w:lvlOverride w:ilvl="0">
-      <w:startOverride w:val="1"/>
-    </w:lvlOverride>
+    <w:abstractNumId w:val="1"/>
   </w:num>
   <w:num w:numId="7">
     <w:abstractNumId w:val="0"/>
@@ -6544,6 +7227,12 @@
     </w:lvlOverride>
   </w:num>
   <w:num w:numId="8">
+    <w:abstractNumId w:val="0"/>
+    <w:lvlOverride w:ilvl="0">
+      <w:startOverride w:val="1"/>
+    </w:lvlOverride>
+  </w:num>
+  <w:num w:numId="9">
     <w:abstractNumId w:val="1"/>
   </w:num>
 </w:numbering>

</xml_diff>